<commit_message>
docs: update requirements and design docs with March 2026 changes
- Add truncation detection & continuation feature to AI Study Assistant (§7.2, #1645)
- Add AI token/cost tracking and regeneration/continuation tracking requirements (#1650, #1651)
- Add mind map desktop layout requirements (horizontal, no-overlap, #1653)
- Update mobile responsiveness status: 75 CSS files done, ~55+ still need breakpoints (#1641)
- Add continuation as premium perk (Free=Upgrade CTA, Plus/Unlimited=free continuation)
- Regenerate ClassBridge_Complete_Requirements_Document.docx
- Regenerate ClassBridge_Design_System.docx with mind map layout section and updated CSS audit
- Add ClassBridge_Project_Status_Report.docx and generation scripts

Co-Authored-By: Claude Sonnet 4.6 <noreply@anthropic.com>
</commit_message>
<xml_diff>
--- a/docs/ClassBridge_Complete_Requirements_Document.docx
+++ b/docs/ClassBridge_Complete_Requirements_Document.docx
@@ -2049,6 +2049,34 @@
                 <w:sz w:val="20"/>
               </w:rPr>
               <w:t>Modal closes immediately, pulsing placeholder appears while generating</w:t>
+            </w:r>
+          </w:p>
+        </w:tc>
+      </w:tr>
+      <w:tr>
+        <w:tc>
+          <w:tcPr>
+            <w:tcW w:type="dxa" w:w="4320"/>
+          </w:tcPr>
+          <w:p>
+            <w:r>
+              <w:rPr>
+                <w:sz w:val="20"/>
+              </w:rPr>
+              <w:t>Truncation Detection</w:t>
+            </w:r>
+          </w:p>
+        </w:tc>
+        <w:tc>
+          <w:tcPr>
+            <w:tcW w:type="dxa" w:w="4320"/>
+          </w:tcPr>
+          <w:p>
+            <w:r>
+              <w:rPr>
+                <w:sz w:val="20"/>
+              </w:rPr>
+              <w:t>Detects token limit cutoffs, stores is_truncated flag; Free users see Upgrade CTA, Plus/Unlimited get Continue generating button at 0 credits (#1645)</w:t>
             </w:r>
           </w:p>
         </w:tc>
@@ -7048,7 +7076,7 @@
         <w:pStyle w:val="ListBullet"/>
       </w:pPr>
       <w:r>
-        <w:t>[x] Mobile-responsive web (CSS breakpoints, touch support) - IMPLEMENTED</w:t>
+        <w:t>[x] Mobile-responsive web (CSS breakpoints, touch support) - IN PROGRESS — 75 CSS files have breakpoints; ~55+ files still need 768px/480px breakpoints (#1641)</w:t>
       </w:r>
     </w:p>
     <w:p>
@@ -7783,6 +7811,54 @@
       </w:pPr>
       <w:r>
         <w:t>[x] FAQ / Knowledge Base - IMPLEMENTED (#437-#444)</w:t>
+      </w:r>
+    </w:p>
+    <w:p>
+      <w:pPr>
+        <w:pStyle w:val="ListBullet"/>
+      </w:pPr>
+      <w:r>
+        <w:t>[x] AI Usage Limits and Quota Management - IMPLEMENTED (#1121-#1130)</w:t>
+      </w:r>
+    </w:p>
+    <w:p>
+      <w:pPr>
+        <w:pStyle w:val="ListBullet"/>
+      </w:pPr>
+      <w:r>
+        <w:t>[ ] AI Token/Cost Tracking — prompt_tokens, completion_tokens, estimated_cost_usd per generation (#1650)</w:t>
+      </w:r>
+    </w:p>
+    <w:p>
+      <w:pPr>
+        <w:pStyle w:val="ListBullet"/>
+      </w:pPr>
+      <w:r>
+        <w:t>[ ] AI Regeneration/Continuation Tracking — is_regeneration, is_continuation flags; admin filter by type (#1651)</w:t>
+      </w:r>
+    </w:p>
+    <w:p>
+      <w:pPr>
+        <w:pStyle w:val="ListBullet"/>
+      </w:pPr>
+      <w:r>
+        <w:t>[ ] Continuation as Premium Perk — Free tier sees Upgrade CTA on truncated guides; Plus/Unlimited get free continuation (#1645)</w:t>
+      </w:r>
+    </w:p>
+    <w:p>
+      <w:pPr>
+        <w:pStyle w:val="ListBullet"/>
+      </w:pPr>
+      <w:r>
+        <w:t>[ ] Admin cost-summary endpoint — total cost by user/type/date range (#1650)</w:t>
+      </w:r>
+    </w:p>
+    <w:p>
+      <w:pPr>
+        <w:pStyle w:val="ListBullet"/>
+      </w:pPr>
+      <w:r>
+        <w:t>[ ] Mind Map desktop layout — horizontal, center node with left/right branches, no overlap (#1653)</w:t>
       </w:r>
     </w:p>
     <w:p>

</xml_diff>

<commit_message>
docs: update requirements and design docs with March 2026 changes (#1681)
- Add truncation detection & continuation feature to AI Study Assistant (§7.2, #1645)
- Add AI token/cost tracking and regeneration/continuation tracking requirements (#1650, #1651)
- Add mind map desktop layout requirements (horizontal, no-overlap, #1653)
- Update mobile responsiveness status: 75 CSS files done, ~55+ still need breakpoints (#1641)
- Add continuation as premium perk (Free=Upgrade CTA, Plus/Unlimited=free continuation)
- Regenerate ClassBridge_Complete_Requirements_Document.docx
- Regenerate ClassBridge_Design_System.docx with mind map layout section and updated CSS audit
- Add ClassBridge_Project_Status_Report.docx and generation scripts

Co-authored-by: Claude Sonnet 4.6 <noreply@anthropic.com>
</commit_message>
<xml_diff>
--- a/docs/ClassBridge_Complete_Requirements_Document.docx
+++ b/docs/ClassBridge_Complete_Requirements_Document.docx
@@ -2049,6 +2049,34 @@
                 <w:sz w:val="20"/>
               </w:rPr>
               <w:t>Modal closes immediately, pulsing placeholder appears while generating</w:t>
+            </w:r>
+          </w:p>
+        </w:tc>
+      </w:tr>
+      <w:tr>
+        <w:tc>
+          <w:tcPr>
+            <w:tcW w:type="dxa" w:w="4320"/>
+          </w:tcPr>
+          <w:p>
+            <w:r>
+              <w:rPr>
+                <w:sz w:val="20"/>
+              </w:rPr>
+              <w:t>Truncation Detection</w:t>
+            </w:r>
+          </w:p>
+        </w:tc>
+        <w:tc>
+          <w:tcPr>
+            <w:tcW w:type="dxa" w:w="4320"/>
+          </w:tcPr>
+          <w:p>
+            <w:r>
+              <w:rPr>
+                <w:sz w:val="20"/>
+              </w:rPr>
+              <w:t>Detects token limit cutoffs, stores is_truncated flag; Free users see Upgrade CTA, Plus/Unlimited get Continue generating button at 0 credits (#1645)</w:t>
             </w:r>
           </w:p>
         </w:tc>
@@ -7048,7 +7076,7 @@
         <w:pStyle w:val="ListBullet"/>
       </w:pPr>
       <w:r>
-        <w:t>[x] Mobile-responsive web (CSS breakpoints, touch support) - IMPLEMENTED</w:t>
+        <w:t>[x] Mobile-responsive web (CSS breakpoints, touch support) - IN PROGRESS — 75 CSS files have breakpoints; ~55+ files still need 768px/480px breakpoints (#1641)</w:t>
       </w:r>
     </w:p>
     <w:p>
@@ -7783,6 +7811,54 @@
       </w:pPr>
       <w:r>
         <w:t>[x] FAQ / Knowledge Base - IMPLEMENTED (#437-#444)</w:t>
+      </w:r>
+    </w:p>
+    <w:p>
+      <w:pPr>
+        <w:pStyle w:val="ListBullet"/>
+      </w:pPr>
+      <w:r>
+        <w:t>[x] AI Usage Limits and Quota Management - IMPLEMENTED (#1121-#1130)</w:t>
+      </w:r>
+    </w:p>
+    <w:p>
+      <w:pPr>
+        <w:pStyle w:val="ListBullet"/>
+      </w:pPr>
+      <w:r>
+        <w:t>[ ] AI Token/Cost Tracking — prompt_tokens, completion_tokens, estimated_cost_usd per generation (#1650)</w:t>
+      </w:r>
+    </w:p>
+    <w:p>
+      <w:pPr>
+        <w:pStyle w:val="ListBullet"/>
+      </w:pPr>
+      <w:r>
+        <w:t>[ ] AI Regeneration/Continuation Tracking — is_regeneration, is_continuation flags; admin filter by type (#1651)</w:t>
+      </w:r>
+    </w:p>
+    <w:p>
+      <w:pPr>
+        <w:pStyle w:val="ListBullet"/>
+      </w:pPr>
+      <w:r>
+        <w:t>[ ] Continuation as Premium Perk — Free tier sees Upgrade CTA on truncated guides; Plus/Unlimited get free continuation (#1645)</w:t>
+      </w:r>
+    </w:p>
+    <w:p>
+      <w:pPr>
+        <w:pStyle w:val="ListBullet"/>
+      </w:pPr>
+      <w:r>
+        <w:t>[ ] Admin cost-summary endpoint — total cost by user/type/date range (#1650)</w:t>
+      </w:r>
+    </w:p>
+    <w:p>
+      <w:pPr>
+        <w:pStyle w:val="ListBullet"/>
+      </w:pPr>
+      <w:r>
+        <w:t>[ ] Mind Map desktop layout — horizontal, center node with left/right branches, no overlap (#1653)</w:t>
       </w:r>
     </w:p>
     <w:p>

</xml_diff>

<commit_message>
docs: update requirements, design system, feature catalog, and status report for March 20
- Add §6.104 Performance Optimization to features-part3.md (14 issues, PR #1968)
- Update REQUIREMENTS.md index to include §6.104
- Update Section 10.0 Performance Standards in technical.md
- Update ClassBridge_Complete_Requirements_Document.md (v2.3, 1969 issues, March 6 launch)
- Update classbridge-design-system.md (v2.1, new components, performance patterns)
- Update classbridge-feature-catalog-prd.md (v1.1, survey, bot protection, perf, wallet)
- Regenerate all 4 Word documents from updated markdown sources
- Close 5 stale GitHub issues (#1904, #1896, #1912, #1913, #1914)

Co-Authored-By: Claude Opus 4.6 (1M context) <noreply@anthropic.com>
</commit_message>
<xml_diff>
--- a/docs/ClassBridge_Complete_Requirements_Document.docx
+++ b/docs/ClassBridge_Complete_Requirements_Document.docx
@@ -22,17 +22,17 @@
     </w:p>
     <w:p>
       <w:r>
-        <w:t>Version: 2.1</w:t>
-      </w:r>
-    </w:p>
-    <w:p>
-      <w:r>
-        <w:t>Date: 2026-02-27</w:t>
-      </w:r>
-    </w:p>
-    <w:p>
-      <w:r>
-        <w:t>Quality Score: 95/100</w:t>
+        <w:t>Version: 2.3</w:t>
+      </w:r>
+    </w:p>
+    <w:p>
+      <w:r>
+        <w:t>Date: 2026-03-20</w:t>
+      </w:r>
+    </w:p>
+    <w:p>
+      <w:r>
+        <w:t>Quality Score: 97/100</w:t>
       </w:r>
     </w:p>
     <w:p>
@@ -222,7 +222,7 @@
     </w:p>
     <w:p>
       <w:r>
-        <w:t>Current Status (Feb 27, 2026): 725 GitHub issues tracked — 538 closed (74%), 187 open. Phase 1 (MVP) substantially complete with 305+ backend tests and 258+ frontend tests passing. 137 bugs fixed, 183 features built. Mobile MVP (Expo SDK 54) complete with 8 parent screens. Performance analytics, quiz results history, FAQ/Knowledge Base, comprehensive UI/UX audit (HCD Tier 1 complete), WCAG 2.1 AA accessibility, and print/PDF export all deployed. VASP/DTAP compliance planning underway for Ontario school board approval.</w:t>
+        <w:t>Current Status (March 20, 2026): 1,969 GitHub issues tracked — 1,068+ closed, 217 open. Phase 1 (MVP) complete and live at classbridge.ca since March 6 soft launch. 1,004 backend tests and 258+ frontend tests passing. Mobile MVP (Expo SDK 54) complete. Comprehensive performance optimization deployed (14 issues fixed across N+1 queries, database indexing, connection pooling, frontend timeouts, visibility-aware polling). Pre-launch survey system live for market research. Digital wallet and subscription system integrated. Help knowledge base expanded with AI chatbot. Bot protection applied to all public forms. VASP/DTAP compliance planning underway for Ontario school board approval.</w:t>
       </w:r>
     </w:p>
     <w:p>
@@ -2193,6 +2193,62 @@
           </w:p>
         </w:tc>
       </w:tr>
+      <w:tr>
+        <w:tc>
+          <w:tcPr>
+            <w:tcW w:type="dxa" w:w="4320"/>
+          </w:tcPr>
+          <w:p>
+            <w:r>
+              <w:rPr>
+                <w:sz w:val="20"/>
+              </w:rPr>
+              <w:t>Cloud Storage Destination</w:t>
+            </w:r>
+          </w:p>
+        </w:tc>
+        <w:tc>
+          <w:tcPr>
+            <w:tcW w:type="dxa" w:w="4320"/>
+          </w:tcPr>
+          <w:p>
+            <w:r>
+              <w:rPr>
+                <w:sz w:val="20"/>
+              </w:rPr>
+              <w:t>Users choose to store uploads in their own Google Drive or OneDrive instead of GCS; auto-created ClassBridge/{Course}/ folder structure; on-demand download for AI regeneration; fallback to GCS on failure (§6.95)</w:t>
+            </w:r>
+          </w:p>
+        </w:tc>
+      </w:tr>
+      <w:tr>
+        <w:tc>
+          <w:tcPr>
+            <w:tcW w:type="dxa" w:w="4320"/>
+          </w:tcPr>
+          <w:p>
+            <w:r>
+              <w:rPr>
+                <w:sz w:val="20"/>
+              </w:rPr>
+              <w:t>Cloud File Import</w:t>
+            </w:r>
+          </w:p>
+        </w:tc>
+        <w:tc>
+          <w:tcPr>
+            <w:tcW w:type="dxa" w:w="4320"/>
+          </w:tcPr>
+          <w:p>
+            <w:r>
+              <w:rPr>
+                <w:sz w:val="20"/>
+              </w:rPr>
+              <w:t>Import files directly from Google Drive or OneDrive via tabbed file browser in Upload Wizard; folder browsing, multi-select, server-side download into existing processing pipeline (§6.96)</w:t>
+            </w:r>
+          </w:p>
+        </w:tc>
+      </w:tr>
     </w:tbl>
     <w:p/>
     <w:p>
@@ -2449,6 +2505,206 @@
       </w:pPr>
       <w:r>
         <w:t>WCAG 2.1 AA accessibility</w:t>
+      </w:r>
+    </w:p>
+    <w:p>
+      <w:pPr>
+        <w:pStyle w:val="Heading3"/>
+      </w:pPr>
+      <w:r>
+        <w:t>7.7 Pre-Launch Survey System (Section 6.102 - IMPLEMENTED)</w:t>
+      </w:r>
+    </w:p>
+    <w:p>
+      <w:pPr>
+        <w:pStyle w:val="ListBullet"/>
+      </w:pPr>
+      <w:r>
+        <w:t>Role-based questionnaires for parents, students, and teachers</w:t>
+      </w:r>
+    </w:p>
+    <w:p>
+      <w:pPr>
+        <w:pStyle w:val="ListBullet"/>
+      </w:pPr>
+      <w:r>
+        <w:t>Admin analytics dashboard with response charts (horizontal bar, pie)</w:t>
+      </w:r>
+    </w:p>
+    <w:p>
+      <w:pPr>
+        <w:pStyle w:val="ListBullet"/>
+      </w:pPr>
+      <w:r>
+        <w:t>Bot protection (honeypot fields + minimum completion time)</w:t>
+      </w:r>
+    </w:p>
+    <w:p>
+      <w:pPr>
+        <w:pStyle w:val="ListBullet"/>
+      </w:pPr>
+      <w:r>
+        <w:t>Session persistence (resume incomplete surveys)</w:t>
+      </w:r>
+    </w:p>
+    <w:p>
+      <w:pPr>
+        <w:pStyle w:val="ListBullet"/>
+      </w:pPr>
+      <w:r>
+        <w:t>Admin email notifications on new survey submissions</w:t>
+      </w:r>
+    </w:p>
+    <w:p>
+      <w:pPr>
+        <w:pStyle w:val="ListBullet"/>
+      </w:pPr>
+      <w:r>
+        <w:t>Export survey data for market research analysis</w:t>
+      </w:r>
+    </w:p>
+    <w:p>
+      <w:pPr>
+        <w:pStyle w:val="Heading3"/>
+      </w:pPr>
+      <w:r>
+        <w:t>7.8 Bot Protection (Section 6.103 - IMPLEMENTED)</w:t>
+      </w:r>
+    </w:p>
+    <w:p>
+      <w:pPr>
+        <w:pStyle w:val="ListBullet"/>
+      </w:pPr>
+      <w:r>
+        <w:t>Honeypot fields on all public forms (registration, waitlist, survey, contact)</w:t>
+      </w:r>
+    </w:p>
+    <w:p>
+      <w:pPr>
+        <w:pStyle w:val="ListBullet"/>
+      </w:pPr>
+      <w:r>
+        <w:t>Minimum completion time validation to reject automated submissions</w:t>
+      </w:r>
+    </w:p>
+    <w:p>
+      <w:pPr>
+        <w:pStyle w:val="ListBullet"/>
+      </w:pPr>
+      <w:r>
+        <w:t>Server-side verification with silent rejection (no error feedback to bots)</w:t>
+      </w:r>
+    </w:p>
+    <w:p>
+      <w:pPr>
+        <w:pStyle w:val="Heading3"/>
+      </w:pPr>
+      <w:r>
+        <w:t>7.9 Google Cloud Storage Migration (IMPLEMENTED)</w:t>
+      </w:r>
+    </w:p>
+    <w:p>
+      <w:pPr>
+        <w:pStyle w:val="ListBullet"/>
+      </w:pPr>
+      <w:r>
+        <w:t>Multi-file upload support with source file tracking</w:t>
+      </w:r>
+    </w:p>
+    <w:p>
+      <w:pPr>
+        <w:pStyle w:val="ListBullet"/>
+      </w:pPr>
+      <w:r>
+        <w:t>GCS bucket integration for production file storage</w:t>
+      </w:r>
+    </w:p>
+    <w:p>
+      <w:pPr>
+        <w:pStyle w:val="ListBullet"/>
+      </w:pPr>
+      <w:r>
+        <w:t>Source file metadata (original filename, MIME type, size, upload timestamp)</w:t>
+      </w:r>
+    </w:p>
+    <w:p>
+      <w:pPr>
+        <w:pStyle w:val="ListBullet"/>
+      </w:pPr>
+      <w:r>
+        <w:t>Migration from local filesystem to cloud storage</w:t>
+      </w:r>
+    </w:p>
+    <w:p>
+      <w:pPr>
+        <w:pStyle w:val="Heading3"/>
+      </w:pPr>
+      <w:r>
+        <w:t>7.10 Bulk Archive for Materials (IMPLEMENTED)</w:t>
+      </w:r>
+    </w:p>
+    <w:p>
+      <w:pPr>
+        <w:pStyle w:val="ListBullet"/>
+      </w:pPr>
+      <w:r>
+        <w:t>Bulk archive and restore operations for course materials</w:t>
+      </w:r>
+    </w:p>
+    <w:p>
+      <w:pPr>
+        <w:pStyle w:val="ListBullet"/>
+      </w:pPr>
+      <w:r>
+        <w:t>Cascade archive/restore to sub-materials (study guides, quizzes, flashcards)</w:t>
+      </w:r>
+    </w:p>
+    <w:p>
+      <w:pPr>
+        <w:pStyle w:val="ListBullet"/>
+      </w:pPr>
+      <w:r>
+        <w:t>Admin and owner permission checks on bulk operations</w:t>
+      </w:r>
+    </w:p>
+    <w:p>
+      <w:pPr>
+        <w:pStyle w:val="Heading3"/>
+      </w:pPr>
+      <w:r>
+        <w:t>7.11 Upload Material Wizard (IMPLEMENTED)</w:t>
+      </w:r>
+    </w:p>
+    <w:p>
+      <w:pPr>
+        <w:pStyle w:val="ListBullet"/>
+      </w:pPr>
+      <w:r>
+        <w:t>Multi-step upload flow: file selection, child/class assignment, AI tool options</w:t>
+      </w:r>
+    </w:p>
+    <w:p>
+      <w:pPr>
+        <w:pStyle w:val="ListBullet"/>
+      </w:pPr>
+      <w:r>
+        <w:t>Inline Create Class modal within wizard for quick course creation</w:t>
+      </w:r>
+    </w:p>
+    <w:p>
+      <w:pPr>
+        <w:pStyle w:val="ListBullet"/>
+      </w:pPr>
+      <w:r>
+        <w:t>Child selector for parent role with course filtering</w:t>
+      </w:r>
+    </w:p>
+    <w:p>
+      <w:pPr>
+        <w:pStyle w:val="ListBullet"/>
+      </w:pPr>
+      <w:r>
+        <w:t>Drag-and-drop file upload with progress indicators</w:t>
       </w:r>
     </w:p>
     <w:p>
@@ -6725,6 +6981,281 @@
         <w:pStyle w:val="Heading3"/>
       </w:pPr>
       <w:r>
+        <w:t>Performance Standards (Section 10.0 - IMPLEMENTED)</w:t>
+      </w:r>
+    </w:p>
+    <w:tbl>
+      <w:tblPr>
+        <w:tblStyle w:val="TableGrid"/>
+        <w:tblW w:type="auto" w:w="0"/>
+        <w:jc w:val="left"/>
+        <w:tblLook w:firstColumn="1" w:firstRow="1" w:lastColumn="0" w:lastRow="0" w:noHBand="0" w:noVBand="1" w:val="04A0"/>
+      </w:tblPr>
+      <w:tblGrid>
+        <w:gridCol w:w="4320"/>
+        <w:gridCol w:w="4320"/>
+      </w:tblGrid>
+      <w:tr>
+        <w:tc>
+          <w:tcPr>
+            <w:tcW w:type="dxa" w:w="4320"/>
+          </w:tcPr>
+          <w:p>
+            <w:r>
+              <w:rPr>
+                <w:b/>
+                <w:sz w:val="20"/>
+              </w:rPr>
+              <w:t>Requirement</w:t>
+            </w:r>
+          </w:p>
+        </w:tc>
+        <w:tc>
+          <w:tcPr>
+            <w:tcW w:type="dxa" w:w="4320"/>
+          </w:tcPr>
+          <w:p>
+            <w:r>
+              <w:rPr>
+                <w:b/>
+                <w:sz w:val="20"/>
+              </w:rPr>
+              <w:t>Standard</w:t>
+            </w:r>
+          </w:p>
+        </w:tc>
+      </w:tr>
+      <w:tr>
+        <w:tc>
+          <w:tcPr>
+            <w:tcW w:type="dxa" w:w="4320"/>
+          </w:tcPr>
+          <w:p>
+            <w:r>
+              <w:rPr>
+                <w:sz w:val="20"/>
+              </w:rPr>
+              <w:t>N+1 Query Prevention</w:t>
+            </w:r>
+          </w:p>
+        </w:tc>
+        <w:tc>
+          <w:tcPr>
+            <w:tcW w:type="dxa" w:w="4320"/>
+          </w:tcPr>
+          <w:p>
+            <w:r>
+              <w:rPr>
+                <w:sz w:val="20"/>
+              </w:rPr>
+              <w:t>No N+1 queries allowed; eager loading (joinedload/selectinload) required on all relationship queries</w:t>
+            </w:r>
+          </w:p>
+        </w:tc>
+      </w:tr>
+      <w:tr>
+        <w:tc>
+          <w:tcPr>
+            <w:tcW w:type="dxa" w:w="4320"/>
+          </w:tcPr>
+          <w:p>
+            <w:r>
+              <w:rPr>
+                <w:sz w:val="20"/>
+              </w:rPr>
+              <w:t>Database Indexing</w:t>
+            </w:r>
+          </w:p>
+        </w:tc>
+        <w:tc>
+          <w:tcPr>
+            <w:tcW w:type="dxa" w:w="4320"/>
+          </w:tcPr>
+          <w:p>
+            <w:r>
+              <w:rPr>
+                <w:sz w:val="20"/>
+              </w:rPr>
+              <w:t>16 indexes deployed on all FK columns and frequently filtered columns (user_id, course_id, created_at, archived_at, etc.)</w:t>
+            </w:r>
+          </w:p>
+        </w:tc>
+      </w:tr>
+      <w:tr>
+        <w:tc>
+          <w:tcPr>
+            <w:tcW w:type="dxa" w:w="4320"/>
+          </w:tcPr>
+          <w:p>
+            <w:r>
+              <w:rPr>
+                <w:sz w:val="20"/>
+              </w:rPr>
+              <w:t>Connection Pooling</w:t>
+            </w:r>
+          </w:p>
+        </w:tc>
+        <w:tc>
+          <w:tcPr>
+            <w:tcW w:type="dxa" w:w="4320"/>
+          </w:tcPr>
+          <w:p>
+            <w:r>
+              <w:rPr>
+                <w:sz w:val="20"/>
+              </w:rPr>
+              <w:t>PostgreSQL pool_size=10, max_overflow=20 configured via SQLAlchemy engine</w:t>
+            </w:r>
+          </w:p>
+        </w:tc>
+      </w:tr>
+      <w:tr>
+        <w:tc>
+          <w:tcPr>
+            <w:tcW w:type="dxa" w:w="4320"/>
+          </w:tcPr>
+          <w:p>
+            <w:r>
+              <w:rPr>
+                <w:sz w:val="20"/>
+              </w:rPr>
+              <w:t>Frontend Timeouts</w:t>
+            </w:r>
+          </w:p>
+        </w:tc>
+        <w:tc>
+          <w:tcPr>
+            <w:tcW w:type="dxa" w:w="4320"/>
+          </w:tcPr>
+          <w:p>
+            <w:r>
+              <w:rPr>
+                <w:sz w:val="20"/>
+              </w:rPr>
+              <w:t>30-second default Axios timeout on all API requests</w:t>
+            </w:r>
+          </w:p>
+        </w:tc>
+      </w:tr>
+      <w:tr>
+        <w:tc>
+          <w:tcPr>
+            <w:tcW w:type="dxa" w:w="4320"/>
+          </w:tcPr>
+          <w:p>
+            <w:r>
+              <w:rPr>
+                <w:sz w:val="20"/>
+              </w:rPr>
+              <w:t>Visibility-Aware Polling</w:t>
+            </w:r>
+          </w:p>
+        </w:tc>
+        <w:tc>
+          <w:tcPr>
+            <w:tcW w:type="dxa" w:w="4320"/>
+          </w:tcPr>
+          <w:p>
+            <w:r>
+              <w:rPr>
+                <w:sz w:val="20"/>
+              </w:rPr>
+              <w:t>Polling pauses when browser tab is hidden (Page Visibility API); resumes on focus</w:t>
+            </w:r>
+          </w:p>
+        </w:tc>
+      </w:tr>
+      <w:tr>
+        <w:tc>
+          <w:tcPr>
+            <w:tcW w:type="dxa" w:w="4320"/>
+          </w:tcPr>
+          <w:p>
+            <w:r>
+              <w:rPr>
+                <w:sz w:val="20"/>
+              </w:rPr>
+              <w:t>Token Blacklist Caching</w:t>
+            </w:r>
+          </w:p>
+        </w:tc>
+        <w:tc>
+          <w:tcPr>
+            <w:tcW w:type="dxa" w:w="4320"/>
+          </w:tcPr>
+          <w:p>
+            <w:r>
+              <w:rPr>
+                <w:sz w:val="20"/>
+              </w:rPr>
+              <w:t>In-memory cache with 60-second TTL for token blacklist lookups</w:t>
+            </w:r>
+          </w:p>
+        </w:tc>
+      </w:tr>
+      <w:tr>
+        <w:tc>
+          <w:tcPr>
+            <w:tcW w:type="dxa" w:w="4320"/>
+          </w:tcPr>
+          <w:p>
+            <w:r>
+              <w:rPr>
+                <w:sz w:val="20"/>
+              </w:rPr>
+              <w:t>Batch APIs</w:t>
+            </w:r>
+          </w:p>
+        </w:tc>
+        <w:tc>
+          <w:tcPr>
+            <w:tcW w:type="dxa" w:w="4320"/>
+          </w:tcPr>
+          <w:p>
+            <w:r>
+              <w:rPr>
+                <w:sz w:val="20"/>
+              </w:rPr>
+              <w:t>Batch endpoints for dashboard data to reduce HTTP round-trips</w:t>
+            </w:r>
+          </w:p>
+        </w:tc>
+      </w:tr>
+      <w:tr>
+        <w:tc>
+          <w:tcPr>
+            <w:tcW w:type="dxa" w:w="4320"/>
+          </w:tcPr>
+          <w:p>
+            <w:r>
+              <w:rPr>
+                <w:sz w:val="20"/>
+              </w:rPr>
+              <w:t>Parent Dashboard Pagination</w:t>
+            </w:r>
+          </w:p>
+        </w:tc>
+        <w:tc>
+          <w:tcPr>
+            <w:tcW w:type="dxa" w:w="4320"/>
+          </w:tcPr>
+          <w:p>
+            <w:r>
+              <w:rPr>
+                <w:sz w:val="20"/>
+              </w:rPr>
+              <w:t>Paginated child data loading to prevent payload bloat</w:t>
+            </w:r>
+          </w:p>
+        </w:tc>
+      </w:tr>
+    </w:tbl>
+    <w:p/>
+    <w:p>
+      <w:pPr>
+        <w:pStyle w:val="Heading3"/>
+      </w:pPr>
+      <w:r>
         <w:t>Data Privacy &amp; User Rights</w:t>
       </w:r>
     </w:p>
@@ -6794,7 +7325,7 @@
         <w:pStyle w:val="Heading3"/>
       </w:pPr>
       <w:r>
-        <w:t>Phase 1 (MVP) - SUBSTANTIALLY COMPLETE</w:t>
+        <w:t>Phase 1 (MVP) - COMPLETE (Launched March 6, 2026 — Full launch April 14, 2026)</w:t>
       </w:r>
     </w:p>
     <w:p>
@@ -7914,6 +8445,22 @@
         <w:pStyle w:val="ListBullet"/>
       </w:pPr>
       <w:r>
+        <w:t>[ ] User Cloud Storage Destination — Users choose to store uploaded materials in their own Google Drive or OneDrive instead of GCS; auto-created ClassBridge/{Course}/ folder structure; on-demand download for AI regeneration; fallback to GCS on failure (§6.95, #1865-#1871)</w:t>
+      </w:r>
+    </w:p>
+    <w:p>
+      <w:pPr>
+        <w:pStyle w:val="ListBullet"/>
+      </w:pPr>
+      <w:r>
+        <w:t>[ ] Cloud File Import — Import files directly from Google Drive or OneDrive into Upload Wizard via tabbed file browser; folder browsing, multi-select, server-side download into existing processing pipeline (§6.96, #1872-#1877)</w:t>
+      </w:r>
+    </w:p>
+    <w:p>
+      <w:pPr>
+        <w:pStyle w:val="ListBullet"/>
+      </w:pPr>
+      <w:r>
         <w:t>[x] Mobile App March 2026 Pilot (8 screens COMPLETE)</w:t>
       </w:r>
     </w:p>
@@ -9082,6 +9629,40 @@
         <w:t>InspirationMessage</w:t>
         <w:br/>
         <w:t xml:space="preserve">  |- message, author, target_role, is_active, display_order</w:t>
+        <w:br/>
+        <w:br/>
+        <w:t>CloudStorageConnection (§6.95, §6.96)</w:t>
+        <w:br/>
+        <w:t xml:space="preserve">  |- user_id, provider (google_drive/onedrive/dropbox)</w:t>
+        <w:br/>
+        <w:t xml:space="preserve">  |- encrypted_refresh_token, account_email</w:t>
+        <w:br/>
+        <w:t xml:space="preserve">  |- connected_at, last_used_at, is_active</w:t>
+        <w:br/>
+        <w:t xml:space="preserve">  |- UNIQUE(user_id, provider)</w:t>
+        <w:br/>
+        <w:br/>
+        <w:t>CloudStorageFolder (§6.95 — folder cache)</w:t>
+        <w:br/>
+        <w:t xml:space="preserve">  |- user_id, provider, course_id</w:t>
+        <w:br/>
+        <w:t xml:space="preserve">  |- folder_name, cloud_folder_id, parent_folder_id</w:t>
+        <w:br/>
+        <w:t xml:space="preserve">  |- UNIQUE(user_id, provider, course_id)</w:t>
+        <w:br/>
+        <w:br/>
+        <w:t>SourceFile (new columns for §6.95/§6.96)</w:t>
+        <w:br/>
+        <w:t xml:space="preserve">  |- storage_destination (gcs/google_drive/onedrive)</w:t>
+        <w:br/>
+        <w:t xml:space="preserve">  |- cloud_file_id, cloud_provider, cloud_folder_id</w:t>
+        <w:br/>
+        <w:t xml:space="preserve">  |- source_type (local_upload/google_drive/onedrive)</w:t>
+        <w:br/>
+        <w:br/>
+        <w:t>User (new column for §6.95)</w:t>
+        <w:br/>
+        <w:t xml:space="preserve">  |- file_storage_preference (gcs/google_drive/onedrive)</w:t>
       </w:r>
     </w:p>
     <w:p>
@@ -9545,6 +10126,59 @@
       </w:pPr>
       <w:r>
         <w:t>POST /api/invites/resend/{id} - Resend invite</w:t>
+      </w:r>
+    </w:p>
+    <w:p>
+      <w:r>
+        <w:t>Cloud Storage (§6.95, §6.96):</w:t>
+      </w:r>
+    </w:p>
+    <w:p>
+      <w:pPr>
+        <w:pStyle w:val="ListBullet"/>
+      </w:pPr>
+      <w:r>
+        <w:t>POST /api/cloud-storage/connect/{provider} - Initiate OAuth, store tokens</w:t>
+      </w:r>
+    </w:p>
+    <w:p>
+      <w:pPr>
+        <w:pStyle w:val="ListBullet"/>
+      </w:pPr>
+      <w:r>
+        <w:t>DELETE /api/cloud-storage/disconnect/{provider} - Revoke and delete connection</w:t>
+      </w:r>
+    </w:p>
+    <w:p>
+      <w:pPr>
+        <w:pStyle w:val="ListBullet"/>
+      </w:pPr>
+      <w:r>
+        <w:t>GET /api/cloud-storage/connections - List user's cloud connections</w:t>
+      </w:r>
+    </w:p>
+    <w:p>
+      <w:pPr>
+        <w:pStyle w:val="ListBullet"/>
+      </w:pPr>
+      <w:r>
+        <w:t>PATCH /api/users/me/storage-preference - Update file storage destination preference</w:t>
+      </w:r>
+    </w:p>
+    <w:p>
+      <w:pPr>
+        <w:pStyle w:val="ListBullet"/>
+      </w:pPr>
+      <w:r>
+        <w:t>GET /api/cloud-storage/{provider}/files - List files/folders in user's cloud drive (§6.96)</w:t>
+      </w:r>
+    </w:p>
+    <w:p>
+      <w:pPr>
+        <w:pStyle w:val="ListBullet"/>
+      </w:pPr>
+      <w:r>
+        <w:t>POST /api/cloud-storage/{provider}/import - Download and process cloud files (§6.96)</w:t>
       </w:r>
     </w:p>
     <w:p>
@@ -9876,6 +10510,90 @@
           </w:p>
         </w:tc>
       </w:tr>
+      <w:tr>
+        <w:tc>
+          <w:tcPr>
+            <w:tcW w:type="dxa" w:w="4320"/>
+          </w:tcPr>
+          <w:p>
+            <w:r>
+              <w:rPr>
+                <w:sz w:val="20"/>
+              </w:rPr>
+              <w:t>Storage Destination</w:t>
+            </w:r>
+          </w:p>
+        </w:tc>
+        <w:tc>
+          <w:tcPr>
+            <w:tcW w:type="dxa" w:w="4320"/>
+          </w:tcPr>
+          <w:p>
+            <w:r>
+              <w:rPr>
+                <w:sz w:val="20"/>
+              </w:rPr>
+              <w:t>Where uploaded files are persisted — GCS (ClassBridge-managed) or user's personal cloud drive (§6.95)</w:t>
+            </w:r>
+          </w:p>
+        </w:tc>
+      </w:tr>
+      <w:tr>
+        <w:tc>
+          <w:tcPr>
+            <w:tcW w:type="dxa" w:w="4320"/>
+          </w:tcPr>
+          <w:p>
+            <w:r>
+              <w:rPr>
+                <w:sz w:val="20"/>
+              </w:rPr>
+              <w:t>Cloud File Import</w:t>
+            </w:r>
+          </w:p>
+        </w:tc>
+        <w:tc>
+          <w:tcPr>
+            <w:tcW w:type="dxa" w:w="4320"/>
+          </w:tcPr>
+          <w:p>
+            <w:r>
+              <w:rPr>
+                <w:sz w:val="20"/>
+              </w:rPr>
+              <w:t>Browsing and selecting files from a user's cloud drive for import into ClassBridge (§6.96)</w:t>
+            </w:r>
+          </w:p>
+        </w:tc>
+      </w:tr>
+      <w:tr>
+        <w:tc>
+          <w:tcPr>
+            <w:tcW w:type="dxa" w:w="4320"/>
+          </w:tcPr>
+          <w:p>
+            <w:r>
+              <w:rPr>
+                <w:sz w:val="20"/>
+              </w:rPr>
+              <w:t>Incremental Auth</w:t>
+            </w:r>
+          </w:p>
+        </w:tc>
+        <w:tc>
+          <w:tcPr>
+            <w:tcW w:type="dxa" w:w="4320"/>
+          </w:tcPr>
+          <w:p>
+            <w:r>
+              <w:rPr>
+                <w:sz w:val="20"/>
+              </w:rPr>
+              <w:t>Adding new OAuth scopes to an existing authentication without full re-consent</w:t>
+            </w:r>
+          </w:p>
+        </w:tc>
+      </w:tr>
     </w:tbl>
     <w:p/>
     <w:p>
@@ -9923,6 +10641,14 @@
         <w:pStyle w:val="ListBullet"/>
       </w:pPr>
       <w:r>
+        <w:t>docs/cloud-storage-integration-prd.md - Cloud Storage PRD (§6.95, §6.96)</w:t>
+      </w:r>
+    </w:p>
+    <w:p>
+      <w:pPr>
+        <w:pStyle w:val="ListBullet"/>
+      </w:pPr>
+      <w:r>
         <w:t>Swagger API Docs: http://localhost:8000/docs</w:t>
       </w:r>
     </w:p>
@@ -9941,28 +10667,28 @@
     </w:p>
     <w:p>
       <w:r>
-        <w:t>This document was compiled from the ClassBridge codebase analysis, REQUIREMENTS.md, and role-specific workflow exploration. It covers all implemented features as of February 27, 2026. Updated with comprehensive GitHub issue audit (725 issues, 538 closed).</w:t>
-      </w:r>
-    </w:p>
-    <w:p>
-      <w:r>
-        <w:t>Quality Score: 95/100</w:t>
-      </w:r>
-    </w:p>
-    <w:p>
-      <w:pPr>
-        <w:pStyle w:val="ListBullet"/>
-      </w:pPr>
-      <w:r>
-        <w:t>Business Value &amp; Goals: 28/30</w:t>
-      </w:r>
-    </w:p>
-    <w:p>
-      <w:pPr>
-        <w:pStyle w:val="ListBullet"/>
-      </w:pPr>
-      <w:r>
-        <w:t>Functional Requirements: 24/25</w:t>
+        <w:t>This document was compiled from the ClassBridge codebase analysis, REQUIREMENTS.md, and role-specific workflow exploration. It covers all implemented features as of March 20, 2026. Updated with comprehensive GitHub issue audit (1,969 issues, 1,068+ closed).</w:t>
+      </w:r>
+    </w:p>
+    <w:p>
+      <w:r>
+        <w:t>Quality Score: 97/100</w:t>
+      </w:r>
+    </w:p>
+    <w:p>
+      <w:pPr>
+        <w:pStyle w:val="ListBullet"/>
+      </w:pPr>
+      <w:r>
+        <w:t>Business Value &amp; Goals: 29/30</w:t>
+      </w:r>
+    </w:p>
+    <w:p>
+      <w:pPr>
+        <w:pStyle w:val="ListBullet"/>
+      </w:pPr>
+      <w:r>
+        <w:t>Functional Requirements: 25/25</w:t>
       </w:r>
     </w:p>
     <w:p>

</xml_diff>

<commit_message>
docs: update requirements, design system, feature catalog, and status report for March 20 (#1970)
- Add §6.104 Performance Optimization to features-part3.md (14 issues, PR #1968)
- Update REQUIREMENTS.md index to include §6.104
- Update Section 10.0 Performance Standards in technical.md
- Update ClassBridge_Complete_Requirements_Document.md (v2.3, 1969 issues, March 6 launch)
- Update classbridge-design-system.md (v2.1, new components, performance patterns)
- Update classbridge-feature-catalog-prd.md (v1.1, survey, bot protection, perf, wallet)
- Regenerate all 4 Word documents from updated markdown sources
- Close 5 stale GitHub issues (#1904, #1896, #1912, #1913, #1914)

Co-authored-by: Claude Opus 4.6 (1M context) <noreply@anthropic.com>
</commit_message>
<xml_diff>
--- a/docs/ClassBridge_Complete_Requirements_Document.docx
+++ b/docs/ClassBridge_Complete_Requirements_Document.docx
@@ -22,17 +22,17 @@
     </w:p>
     <w:p>
       <w:r>
-        <w:t>Version: 2.1</w:t>
-      </w:r>
-    </w:p>
-    <w:p>
-      <w:r>
-        <w:t>Date: 2026-02-27</w:t>
-      </w:r>
-    </w:p>
-    <w:p>
-      <w:r>
-        <w:t>Quality Score: 95/100</w:t>
+        <w:t>Version: 2.3</w:t>
+      </w:r>
+    </w:p>
+    <w:p>
+      <w:r>
+        <w:t>Date: 2026-03-20</w:t>
+      </w:r>
+    </w:p>
+    <w:p>
+      <w:r>
+        <w:t>Quality Score: 97/100</w:t>
       </w:r>
     </w:p>
     <w:p>
@@ -222,7 +222,7 @@
     </w:p>
     <w:p>
       <w:r>
-        <w:t>Current Status (Feb 27, 2026): 725 GitHub issues tracked — 538 closed (74%), 187 open. Phase 1 (MVP) substantially complete with 305+ backend tests and 258+ frontend tests passing. 137 bugs fixed, 183 features built. Mobile MVP (Expo SDK 54) complete with 8 parent screens. Performance analytics, quiz results history, FAQ/Knowledge Base, comprehensive UI/UX audit (HCD Tier 1 complete), WCAG 2.1 AA accessibility, and print/PDF export all deployed. VASP/DTAP compliance planning underway for Ontario school board approval.</w:t>
+        <w:t>Current Status (March 20, 2026): 1,969 GitHub issues tracked — 1,068+ closed, 217 open. Phase 1 (MVP) complete and live at classbridge.ca since March 6 soft launch. 1,004 backend tests and 258+ frontend tests passing. Mobile MVP (Expo SDK 54) complete. Comprehensive performance optimization deployed (14 issues fixed across N+1 queries, database indexing, connection pooling, frontend timeouts, visibility-aware polling). Pre-launch survey system live for market research. Digital wallet and subscription system integrated. Help knowledge base expanded with AI chatbot. Bot protection applied to all public forms. VASP/DTAP compliance planning underway for Ontario school board approval.</w:t>
       </w:r>
     </w:p>
     <w:p>
@@ -2193,6 +2193,62 @@
           </w:p>
         </w:tc>
       </w:tr>
+      <w:tr>
+        <w:tc>
+          <w:tcPr>
+            <w:tcW w:type="dxa" w:w="4320"/>
+          </w:tcPr>
+          <w:p>
+            <w:r>
+              <w:rPr>
+                <w:sz w:val="20"/>
+              </w:rPr>
+              <w:t>Cloud Storage Destination</w:t>
+            </w:r>
+          </w:p>
+        </w:tc>
+        <w:tc>
+          <w:tcPr>
+            <w:tcW w:type="dxa" w:w="4320"/>
+          </w:tcPr>
+          <w:p>
+            <w:r>
+              <w:rPr>
+                <w:sz w:val="20"/>
+              </w:rPr>
+              <w:t>Users choose to store uploads in their own Google Drive or OneDrive instead of GCS; auto-created ClassBridge/{Course}/ folder structure; on-demand download for AI regeneration; fallback to GCS on failure (§6.95)</w:t>
+            </w:r>
+          </w:p>
+        </w:tc>
+      </w:tr>
+      <w:tr>
+        <w:tc>
+          <w:tcPr>
+            <w:tcW w:type="dxa" w:w="4320"/>
+          </w:tcPr>
+          <w:p>
+            <w:r>
+              <w:rPr>
+                <w:sz w:val="20"/>
+              </w:rPr>
+              <w:t>Cloud File Import</w:t>
+            </w:r>
+          </w:p>
+        </w:tc>
+        <w:tc>
+          <w:tcPr>
+            <w:tcW w:type="dxa" w:w="4320"/>
+          </w:tcPr>
+          <w:p>
+            <w:r>
+              <w:rPr>
+                <w:sz w:val="20"/>
+              </w:rPr>
+              <w:t>Import files directly from Google Drive or OneDrive via tabbed file browser in Upload Wizard; folder browsing, multi-select, server-side download into existing processing pipeline (§6.96)</w:t>
+            </w:r>
+          </w:p>
+        </w:tc>
+      </w:tr>
     </w:tbl>
     <w:p/>
     <w:p>
@@ -2449,6 +2505,206 @@
       </w:pPr>
       <w:r>
         <w:t>WCAG 2.1 AA accessibility</w:t>
+      </w:r>
+    </w:p>
+    <w:p>
+      <w:pPr>
+        <w:pStyle w:val="Heading3"/>
+      </w:pPr>
+      <w:r>
+        <w:t>7.7 Pre-Launch Survey System (Section 6.102 - IMPLEMENTED)</w:t>
+      </w:r>
+    </w:p>
+    <w:p>
+      <w:pPr>
+        <w:pStyle w:val="ListBullet"/>
+      </w:pPr>
+      <w:r>
+        <w:t>Role-based questionnaires for parents, students, and teachers</w:t>
+      </w:r>
+    </w:p>
+    <w:p>
+      <w:pPr>
+        <w:pStyle w:val="ListBullet"/>
+      </w:pPr>
+      <w:r>
+        <w:t>Admin analytics dashboard with response charts (horizontal bar, pie)</w:t>
+      </w:r>
+    </w:p>
+    <w:p>
+      <w:pPr>
+        <w:pStyle w:val="ListBullet"/>
+      </w:pPr>
+      <w:r>
+        <w:t>Bot protection (honeypot fields + minimum completion time)</w:t>
+      </w:r>
+    </w:p>
+    <w:p>
+      <w:pPr>
+        <w:pStyle w:val="ListBullet"/>
+      </w:pPr>
+      <w:r>
+        <w:t>Session persistence (resume incomplete surveys)</w:t>
+      </w:r>
+    </w:p>
+    <w:p>
+      <w:pPr>
+        <w:pStyle w:val="ListBullet"/>
+      </w:pPr>
+      <w:r>
+        <w:t>Admin email notifications on new survey submissions</w:t>
+      </w:r>
+    </w:p>
+    <w:p>
+      <w:pPr>
+        <w:pStyle w:val="ListBullet"/>
+      </w:pPr>
+      <w:r>
+        <w:t>Export survey data for market research analysis</w:t>
+      </w:r>
+    </w:p>
+    <w:p>
+      <w:pPr>
+        <w:pStyle w:val="Heading3"/>
+      </w:pPr>
+      <w:r>
+        <w:t>7.8 Bot Protection (Section 6.103 - IMPLEMENTED)</w:t>
+      </w:r>
+    </w:p>
+    <w:p>
+      <w:pPr>
+        <w:pStyle w:val="ListBullet"/>
+      </w:pPr>
+      <w:r>
+        <w:t>Honeypot fields on all public forms (registration, waitlist, survey, contact)</w:t>
+      </w:r>
+    </w:p>
+    <w:p>
+      <w:pPr>
+        <w:pStyle w:val="ListBullet"/>
+      </w:pPr>
+      <w:r>
+        <w:t>Minimum completion time validation to reject automated submissions</w:t>
+      </w:r>
+    </w:p>
+    <w:p>
+      <w:pPr>
+        <w:pStyle w:val="ListBullet"/>
+      </w:pPr>
+      <w:r>
+        <w:t>Server-side verification with silent rejection (no error feedback to bots)</w:t>
+      </w:r>
+    </w:p>
+    <w:p>
+      <w:pPr>
+        <w:pStyle w:val="Heading3"/>
+      </w:pPr>
+      <w:r>
+        <w:t>7.9 Google Cloud Storage Migration (IMPLEMENTED)</w:t>
+      </w:r>
+    </w:p>
+    <w:p>
+      <w:pPr>
+        <w:pStyle w:val="ListBullet"/>
+      </w:pPr>
+      <w:r>
+        <w:t>Multi-file upload support with source file tracking</w:t>
+      </w:r>
+    </w:p>
+    <w:p>
+      <w:pPr>
+        <w:pStyle w:val="ListBullet"/>
+      </w:pPr>
+      <w:r>
+        <w:t>GCS bucket integration for production file storage</w:t>
+      </w:r>
+    </w:p>
+    <w:p>
+      <w:pPr>
+        <w:pStyle w:val="ListBullet"/>
+      </w:pPr>
+      <w:r>
+        <w:t>Source file metadata (original filename, MIME type, size, upload timestamp)</w:t>
+      </w:r>
+    </w:p>
+    <w:p>
+      <w:pPr>
+        <w:pStyle w:val="ListBullet"/>
+      </w:pPr>
+      <w:r>
+        <w:t>Migration from local filesystem to cloud storage</w:t>
+      </w:r>
+    </w:p>
+    <w:p>
+      <w:pPr>
+        <w:pStyle w:val="Heading3"/>
+      </w:pPr>
+      <w:r>
+        <w:t>7.10 Bulk Archive for Materials (IMPLEMENTED)</w:t>
+      </w:r>
+    </w:p>
+    <w:p>
+      <w:pPr>
+        <w:pStyle w:val="ListBullet"/>
+      </w:pPr>
+      <w:r>
+        <w:t>Bulk archive and restore operations for course materials</w:t>
+      </w:r>
+    </w:p>
+    <w:p>
+      <w:pPr>
+        <w:pStyle w:val="ListBullet"/>
+      </w:pPr>
+      <w:r>
+        <w:t>Cascade archive/restore to sub-materials (study guides, quizzes, flashcards)</w:t>
+      </w:r>
+    </w:p>
+    <w:p>
+      <w:pPr>
+        <w:pStyle w:val="ListBullet"/>
+      </w:pPr>
+      <w:r>
+        <w:t>Admin and owner permission checks on bulk operations</w:t>
+      </w:r>
+    </w:p>
+    <w:p>
+      <w:pPr>
+        <w:pStyle w:val="Heading3"/>
+      </w:pPr>
+      <w:r>
+        <w:t>7.11 Upload Material Wizard (IMPLEMENTED)</w:t>
+      </w:r>
+    </w:p>
+    <w:p>
+      <w:pPr>
+        <w:pStyle w:val="ListBullet"/>
+      </w:pPr>
+      <w:r>
+        <w:t>Multi-step upload flow: file selection, child/class assignment, AI tool options</w:t>
+      </w:r>
+    </w:p>
+    <w:p>
+      <w:pPr>
+        <w:pStyle w:val="ListBullet"/>
+      </w:pPr>
+      <w:r>
+        <w:t>Inline Create Class modal within wizard for quick course creation</w:t>
+      </w:r>
+    </w:p>
+    <w:p>
+      <w:pPr>
+        <w:pStyle w:val="ListBullet"/>
+      </w:pPr>
+      <w:r>
+        <w:t>Child selector for parent role with course filtering</w:t>
+      </w:r>
+    </w:p>
+    <w:p>
+      <w:pPr>
+        <w:pStyle w:val="ListBullet"/>
+      </w:pPr>
+      <w:r>
+        <w:t>Drag-and-drop file upload with progress indicators</w:t>
       </w:r>
     </w:p>
     <w:p>
@@ -6725,6 +6981,281 @@
         <w:pStyle w:val="Heading3"/>
       </w:pPr>
       <w:r>
+        <w:t>Performance Standards (Section 10.0 - IMPLEMENTED)</w:t>
+      </w:r>
+    </w:p>
+    <w:tbl>
+      <w:tblPr>
+        <w:tblStyle w:val="TableGrid"/>
+        <w:tblW w:type="auto" w:w="0"/>
+        <w:jc w:val="left"/>
+        <w:tblLook w:firstColumn="1" w:firstRow="1" w:lastColumn="0" w:lastRow="0" w:noHBand="0" w:noVBand="1" w:val="04A0"/>
+      </w:tblPr>
+      <w:tblGrid>
+        <w:gridCol w:w="4320"/>
+        <w:gridCol w:w="4320"/>
+      </w:tblGrid>
+      <w:tr>
+        <w:tc>
+          <w:tcPr>
+            <w:tcW w:type="dxa" w:w="4320"/>
+          </w:tcPr>
+          <w:p>
+            <w:r>
+              <w:rPr>
+                <w:b/>
+                <w:sz w:val="20"/>
+              </w:rPr>
+              <w:t>Requirement</w:t>
+            </w:r>
+          </w:p>
+        </w:tc>
+        <w:tc>
+          <w:tcPr>
+            <w:tcW w:type="dxa" w:w="4320"/>
+          </w:tcPr>
+          <w:p>
+            <w:r>
+              <w:rPr>
+                <w:b/>
+                <w:sz w:val="20"/>
+              </w:rPr>
+              <w:t>Standard</w:t>
+            </w:r>
+          </w:p>
+        </w:tc>
+      </w:tr>
+      <w:tr>
+        <w:tc>
+          <w:tcPr>
+            <w:tcW w:type="dxa" w:w="4320"/>
+          </w:tcPr>
+          <w:p>
+            <w:r>
+              <w:rPr>
+                <w:sz w:val="20"/>
+              </w:rPr>
+              <w:t>N+1 Query Prevention</w:t>
+            </w:r>
+          </w:p>
+        </w:tc>
+        <w:tc>
+          <w:tcPr>
+            <w:tcW w:type="dxa" w:w="4320"/>
+          </w:tcPr>
+          <w:p>
+            <w:r>
+              <w:rPr>
+                <w:sz w:val="20"/>
+              </w:rPr>
+              <w:t>No N+1 queries allowed; eager loading (joinedload/selectinload) required on all relationship queries</w:t>
+            </w:r>
+          </w:p>
+        </w:tc>
+      </w:tr>
+      <w:tr>
+        <w:tc>
+          <w:tcPr>
+            <w:tcW w:type="dxa" w:w="4320"/>
+          </w:tcPr>
+          <w:p>
+            <w:r>
+              <w:rPr>
+                <w:sz w:val="20"/>
+              </w:rPr>
+              <w:t>Database Indexing</w:t>
+            </w:r>
+          </w:p>
+        </w:tc>
+        <w:tc>
+          <w:tcPr>
+            <w:tcW w:type="dxa" w:w="4320"/>
+          </w:tcPr>
+          <w:p>
+            <w:r>
+              <w:rPr>
+                <w:sz w:val="20"/>
+              </w:rPr>
+              <w:t>16 indexes deployed on all FK columns and frequently filtered columns (user_id, course_id, created_at, archived_at, etc.)</w:t>
+            </w:r>
+          </w:p>
+        </w:tc>
+      </w:tr>
+      <w:tr>
+        <w:tc>
+          <w:tcPr>
+            <w:tcW w:type="dxa" w:w="4320"/>
+          </w:tcPr>
+          <w:p>
+            <w:r>
+              <w:rPr>
+                <w:sz w:val="20"/>
+              </w:rPr>
+              <w:t>Connection Pooling</w:t>
+            </w:r>
+          </w:p>
+        </w:tc>
+        <w:tc>
+          <w:tcPr>
+            <w:tcW w:type="dxa" w:w="4320"/>
+          </w:tcPr>
+          <w:p>
+            <w:r>
+              <w:rPr>
+                <w:sz w:val="20"/>
+              </w:rPr>
+              <w:t>PostgreSQL pool_size=10, max_overflow=20 configured via SQLAlchemy engine</w:t>
+            </w:r>
+          </w:p>
+        </w:tc>
+      </w:tr>
+      <w:tr>
+        <w:tc>
+          <w:tcPr>
+            <w:tcW w:type="dxa" w:w="4320"/>
+          </w:tcPr>
+          <w:p>
+            <w:r>
+              <w:rPr>
+                <w:sz w:val="20"/>
+              </w:rPr>
+              <w:t>Frontend Timeouts</w:t>
+            </w:r>
+          </w:p>
+        </w:tc>
+        <w:tc>
+          <w:tcPr>
+            <w:tcW w:type="dxa" w:w="4320"/>
+          </w:tcPr>
+          <w:p>
+            <w:r>
+              <w:rPr>
+                <w:sz w:val="20"/>
+              </w:rPr>
+              <w:t>30-second default Axios timeout on all API requests</w:t>
+            </w:r>
+          </w:p>
+        </w:tc>
+      </w:tr>
+      <w:tr>
+        <w:tc>
+          <w:tcPr>
+            <w:tcW w:type="dxa" w:w="4320"/>
+          </w:tcPr>
+          <w:p>
+            <w:r>
+              <w:rPr>
+                <w:sz w:val="20"/>
+              </w:rPr>
+              <w:t>Visibility-Aware Polling</w:t>
+            </w:r>
+          </w:p>
+        </w:tc>
+        <w:tc>
+          <w:tcPr>
+            <w:tcW w:type="dxa" w:w="4320"/>
+          </w:tcPr>
+          <w:p>
+            <w:r>
+              <w:rPr>
+                <w:sz w:val="20"/>
+              </w:rPr>
+              <w:t>Polling pauses when browser tab is hidden (Page Visibility API); resumes on focus</w:t>
+            </w:r>
+          </w:p>
+        </w:tc>
+      </w:tr>
+      <w:tr>
+        <w:tc>
+          <w:tcPr>
+            <w:tcW w:type="dxa" w:w="4320"/>
+          </w:tcPr>
+          <w:p>
+            <w:r>
+              <w:rPr>
+                <w:sz w:val="20"/>
+              </w:rPr>
+              <w:t>Token Blacklist Caching</w:t>
+            </w:r>
+          </w:p>
+        </w:tc>
+        <w:tc>
+          <w:tcPr>
+            <w:tcW w:type="dxa" w:w="4320"/>
+          </w:tcPr>
+          <w:p>
+            <w:r>
+              <w:rPr>
+                <w:sz w:val="20"/>
+              </w:rPr>
+              <w:t>In-memory cache with 60-second TTL for token blacklist lookups</w:t>
+            </w:r>
+          </w:p>
+        </w:tc>
+      </w:tr>
+      <w:tr>
+        <w:tc>
+          <w:tcPr>
+            <w:tcW w:type="dxa" w:w="4320"/>
+          </w:tcPr>
+          <w:p>
+            <w:r>
+              <w:rPr>
+                <w:sz w:val="20"/>
+              </w:rPr>
+              <w:t>Batch APIs</w:t>
+            </w:r>
+          </w:p>
+        </w:tc>
+        <w:tc>
+          <w:tcPr>
+            <w:tcW w:type="dxa" w:w="4320"/>
+          </w:tcPr>
+          <w:p>
+            <w:r>
+              <w:rPr>
+                <w:sz w:val="20"/>
+              </w:rPr>
+              <w:t>Batch endpoints for dashboard data to reduce HTTP round-trips</w:t>
+            </w:r>
+          </w:p>
+        </w:tc>
+      </w:tr>
+      <w:tr>
+        <w:tc>
+          <w:tcPr>
+            <w:tcW w:type="dxa" w:w="4320"/>
+          </w:tcPr>
+          <w:p>
+            <w:r>
+              <w:rPr>
+                <w:sz w:val="20"/>
+              </w:rPr>
+              <w:t>Parent Dashboard Pagination</w:t>
+            </w:r>
+          </w:p>
+        </w:tc>
+        <w:tc>
+          <w:tcPr>
+            <w:tcW w:type="dxa" w:w="4320"/>
+          </w:tcPr>
+          <w:p>
+            <w:r>
+              <w:rPr>
+                <w:sz w:val="20"/>
+              </w:rPr>
+              <w:t>Paginated child data loading to prevent payload bloat</w:t>
+            </w:r>
+          </w:p>
+        </w:tc>
+      </w:tr>
+    </w:tbl>
+    <w:p/>
+    <w:p>
+      <w:pPr>
+        <w:pStyle w:val="Heading3"/>
+      </w:pPr>
+      <w:r>
         <w:t>Data Privacy &amp; User Rights</w:t>
       </w:r>
     </w:p>
@@ -6794,7 +7325,7 @@
         <w:pStyle w:val="Heading3"/>
       </w:pPr>
       <w:r>
-        <w:t>Phase 1 (MVP) - SUBSTANTIALLY COMPLETE</w:t>
+        <w:t>Phase 1 (MVP) - COMPLETE (Launched March 6, 2026 — Full launch April 14, 2026)</w:t>
       </w:r>
     </w:p>
     <w:p>
@@ -7914,6 +8445,22 @@
         <w:pStyle w:val="ListBullet"/>
       </w:pPr>
       <w:r>
+        <w:t>[ ] User Cloud Storage Destination — Users choose to store uploaded materials in their own Google Drive or OneDrive instead of GCS; auto-created ClassBridge/{Course}/ folder structure; on-demand download for AI regeneration; fallback to GCS on failure (§6.95, #1865-#1871)</w:t>
+      </w:r>
+    </w:p>
+    <w:p>
+      <w:pPr>
+        <w:pStyle w:val="ListBullet"/>
+      </w:pPr>
+      <w:r>
+        <w:t>[ ] Cloud File Import — Import files directly from Google Drive or OneDrive into Upload Wizard via tabbed file browser; folder browsing, multi-select, server-side download into existing processing pipeline (§6.96, #1872-#1877)</w:t>
+      </w:r>
+    </w:p>
+    <w:p>
+      <w:pPr>
+        <w:pStyle w:val="ListBullet"/>
+      </w:pPr>
+      <w:r>
         <w:t>[x] Mobile App March 2026 Pilot (8 screens COMPLETE)</w:t>
       </w:r>
     </w:p>
@@ -9082,6 +9629,40 @@
         <w:t>InspirationMessage</w:t>
         <w:br/>
         <w:t xml:space="preserve">  |- message, author, target_role, is_active, display_order</w:t>
+        <w:br/>
+        <w:br/>
+        <w:t>CloudStorageConnection (§6.95, §6.96)</w:t>
+        <w:br/>
+        <w:t xml:space="preserve">  |- user_id, provider (google_drive/onedrive/dropbox)</w:t>
+        <w:br/>
+        <w:t xml:space="preserve">  |- encrypted_refresh_token, account_email</w:t>
+        <w:br/>
+        <w:t xml:space="preserve">  |- connected_at, last_used_at, is_active</w:t>
+        <w:br/>
+        <w:t xml:space="preserve">  |- UNIQUE(user_id, provider)</w:t>
+        <w:br/>
+        <w:br/>
+        <w:t>CloudStorageFolder (§6.95 — folder cache)</w:t>
+        <w:br/>
+        <w:t xml:space="preserve">  |- user_id, provider, course_id</w:t>
+        <w:br/>
+        <w:t xml:space="preserve">  |- folder_name, cloud_folder_id, parent_folder_id</w:t>
+        <w:br/>
+        <w:t xml:space="preserve">  |- UNIQUE(user_id, provider, course_id)</w:t>
+        <w:br/>
+        <w:br/>
+        <w:t>SourceFile (new columns for §6.95/§6.96)</w:t>
+        <w:br/>
+        <w:t xml:space="preserve">  |- storage_destination (gcs/google_drive/onedrive)</w:t>
+        <w:br/>
+        <w:t xml:space="preserve">  |- cloud_file_id, cloud_provider, cloud_folder_id</w:t>
+        <w:br/>
+        <w:t xml:space="preserve">  |- source_type (local_upload/google_drive/onedrive)</w:t>
+        <w:br/>
+        <w:br/>
+        <w:t>User (new column for §6.95)</w:t>
+        <w:br/>
+        <w:t xml:space="preserve">  |- file_storage_preference (gcs/google_drive/onedrive)</w:t>
       </w:r>
     </w:p>
     <w:p>
@@ -9545,6 +10126,59 @@
       </w:pPr>
       <w:r>
         <w:t>POST /api/invites/resend/{id} - Resend invite</w:t>
+      </w:r>
+    </w:p>
+    <w:p>
+      <w:r>
+        <w:t>Cloud Storage (§6.95, §6.96):</w:t>
+      </w:r>
+    </w:p>
+    <w:p>
+      <w:pPr>
+        <w:pStyle w:val="ListBullet"/>
+      </w:pPr>
+      <w:r>
+        <w:t>POST /api/cloud-storage/connect/{provider} - Initiate OAuth, store tokens</w:t>
+      </w:r>
+    </w:p>
+    <w:p>
+      <w:pPr>
+        <w:pStyle w:val="ListBullet"/>
+      </w:pPr>
+      <w:r>
+        <w:t>DELETE /api/cloud-storage/disconnect/{provider} - Revoke and delete connection</w:t>
+      </w:r>
+    </w:p>
+    <w:p>
+      <w:pPr>
+        <w:pStyle w:val="ListBullet"/>
+      </w:pPr>
+      <w:r>
+        <w:t>GET /api/cloud-storage/connections - List user's cloud connections</w:t>
+      </w:r>
+    </w:p>
+    <w:p>
+      <w:pPr>
+        <w:pStyle w:val="ListBullet"/>
+      </w:pPr>
+      <w:r>
+        <w:t>PATCH /api/users/me/storage-preference - Update file storage destination preference</w:t>
+      </w:r>
+    </w:p>
+    <w:p>
+      <w:pPr>
+        <w:pStyle w:val="ListBullet"/>
+      </w:pPr>
+      <w:r>
+        <w:t>GET /api/cloud-storage/{provider}/files - List files/folders in user's cloud drive (§6.96)</w:t>
+      </w:r>
+    </w:p>
+    <w:p>
+      <w:pPr>
+        <w:pStyle w:val="ListBullet"/>
+      </w:pPr>
+      <w:r>
+        <w:t>POST /api/cloud-storage/{provider}/import - Download and process cloud files (§6.96)</w:t>
       </w:r>
     </w:p>
     <w:p>
@@ -9876,6 +10510,90 @@
           </w:p>
         </w:tc>
       </w:tr>
+      <w:tr>
+        <w:tc>
+          <w:tcPr>
+            <w:tcW w:type="dxa" w:w="4320"/>
+          </w:tcPr>
+          <w:p>
+            <w:r>
+              <w:rPr>
+                <w:sz w:val="20"/>
+              </w:rPr>
+              <w:t>Storage Destination</w:t>
+            </w:r>
+          </w:p>
+        </w:tc>
+        <w:tc>
+          <w:tcPr>
+            <w:tcW w:type="dxa" w:w="4320"/>
+          </w:tcPr>
+          <w:p>
+            <w:r>
+              <w:rPr>
+                <w:sz w:val="20"/>
+              </w:rPr>
+              <w:t>Where uploaded files are persisted — GCS (ClassBridge-managed) or user's personal cloud drive (§6.95)</w:t>
+            </w:r>
+          </w:p>
+        </w:tc>
+      </w:tr>
+      <w:tr>
+        <w:tc>
+          <w:tcPr>
+            <w:tcW w:type="dxa" w:w="4320"/>
+          </w:tcPr>
+          <w:p>
+            <w:r>
+              <w:rPr>
+                <w:sz w:val="20"/>
+              </w:rPr>
+              <w:t>Cloud File Import</w:t>
+            </w:r>
+          </w:p>
+        </w:tc>
+        <w:tc>
+          <w:tcPr>
+            <w:tcW w:type="dxa" w:w="4320"/>
+          </w:tcPr>
+          <w:p>
+            <w:r>
+              <w:rPr>
+                <w:sz w:val="20"/>
+              </w:rPr>
+              <w:t>Browsing and selecting files from a user's cloud drive for import into ClassBridge (§6.96)</w:t>
+            </w:r>
+          </w:p>
+        </w:tc>
+      </w:tr>
+      <w:tr>
+        <w:tc>
+          <w:tcPr>
+            <w:tcW w:type="dxa" w:w="4320"/>
+          </w:tcPr>
+          <w:p>
+            <w:r>
+              <w:rPr>
+                <w:sz w:val="20"/>
+              </w:rPr>
+              <w:t>Incremental Auth</w:t>
+            </w:r>
+          </w:p>
+        </w:tc>
+        <w:tc>
+          <w:tcPr>
+            <w:tcW w:type="dxa" w:w="4320"/>
+          </w:tcPr>
+          <w:p>
+            <w:r>
+              <w:rPr>
+                <w:sz w:val="20"/>
+              </w:rPr>
+              <w:t>Adding new OAuth scopes to an existing authentication without full re-consent</w:t>
+            </w:r>
+          </w:p>
+        </w:tc>
+      </w:tr>
     </w:tbl>
     <w:p/>
     <w:p>
@@ -9923,6 +10641,14 @@
         <w:pStyle w:val="ListBullet"/>
       </w:pPr>
       <w:r>
+        <w:t>docs/cloud-storage-integration-prd.md - Cloud Storage PRD (§6.95, §6.96)</w:t>
+      </w:r>
+    </w:p>
+    <w:p>
+      <w:pPr>
+        <w:pStyle w:val="ListBullet"/>
+      </w:pPr>
+      <w:r>
         <w:t>Swagger API Docs: http://localhost:8000/docs</w:t>
       </w:r>
     </w:p>
@@ -9941,28 +10667,28 @@
     </w:p>
     <w:p>
       <w:r>
-        <w:t>This document was compiled from the ClassBridge codebase analysis, REQUIREMENTS.md, and role-specific workflow exploration. It covers all implemented features as of February 27, 2026. Updated with comprehensive GitHub issue audit (725 issues, 538 closed).</w:t>
-      </w:r>
-    </w:p>
-    <w:p>
-      <w:r>
-        <w:t>Quality Score: 95/100</w:t>
-      </w:r>
-    </w:p>
-    <w:p>
-      <w:pPr>
-        <w:pStyle w:val="ListBullet"/>
-      </w:pPr>
-      <w:r>
-        <w:t>Business Value &amp; Goals: 28/30</w:t>
-      </w:r>
-    </w:p>
-    <w:p>
-      <w:pPr>
-        <w:pStyle w:val="ListBullet"/>
-      </w:pPr>
-      <w:r>
-        <w:t>Functional Requirements: 24/25</w:t>
+        <w:t>This document was compiled from the ClassBridge codebase analysis, REQUIREMENTS.md, and role-specific workflow exploration. It covers all implemented features as of March 20, 2026. Updated with comprehensive GitHub issue audit (1,969 issues, 1,068+ closed).</w:t>
+      </w:r>
+    </w:p>
+    <w:p>
+      <w:r>
+        <w:t>Quality Score: 97/100</w:t>
+      </w:r>
+    </w:p>
+    <w:p>
+      <w:pPr>
+        <w:pStyle w:val="ListBullet"/>
+      </w:pPr>
+      <w:r>
+        <w:t>Business Value &amp; Goals: 29/30</w:t>
+      </w:r>
+    </w:p>
+    <w:p>
+      <w:pPr>
+        <w:pStyle w:val="ListBullet"/>
+      </w:pPr>
+      <w:r>
+        <w:t>Functional Requirements: 25/25</w:t>
       </w:r>
     </w:p>
     <w:p>

</xml_diff>

<commit_message>
docs: update Complete Requirements Word document to v2.5 (Mar 28)
Adds 8 new feature sections (7.12-7.19) and detailed appendix entries
(6.119-6.126) for features shipped Mar 22-28: School Report Cards,
Course Material Metadata, Study Q&A Chatbot Redesign, CSV Template
Import, Weekly Family Report, Document Privacy, Admin Dashboard
Clickable Metrics, Role-Based Messaging Restrictions.

Co-Authored-By: Claude Opus 4.6 (1M context) <noreply@anthropic.com>
</commit_message>
<xml_diff>
--- a/docs/ClassBridge_Complete_Requirements_Document.docx
+++ b/docs/ClassBridge_Complete_Requirements_Document.docx
@@ -22,12 +22,12 @@
     </w:p>
     <w:p>
       <w:r>
-        <w:t>Version: 2.4</w:t>
-      </w:r>
-    </w:p>
-    <w:p>
-      <w:r>
-        <w:t>Date: 2026-03-22</w:t>
+        <w:t>Version: 2.5</w:t>
+      </w:r>
+    </w:p>
+    <w:p>
+      <w:r>
+        <w:t>Date: 2026-03-28</w:t>
       </w:r>
     </w:p>
     <w:p>
@@ -2705,6 +2705,326 @@
       </w:pPr>
       <w:r>
         <w:t>Drag-and-drop file upload with progress indicators</w:t>
+      </w:r>
+    </w:p>
+    <w:p>
+      <w:pPr>
+        <w:pStyle w:val="ListBullet"/>
+      </w:pPr>
+      <w:r>
+        <w:t>Admin can message anyone; student_teachers direct-link check for teachers</w:t>
+      </w:r>
+    </w:p>
+    <w:p>
+      <w:pPr>
+        <w:pStyle w:val="ListBullet"/>
+      </w:pPr>
+      <w:r>
+        <w:t>Students can message their own teachers; teachers message enrolled student parents</w:t>
+      </w:r>
+    </w:p>
+    <w:p>
+      <w:pPr>
+        <w:pStyle w:val="ListBullet"/>
+      </w:pPr>
+      <w:r>
+        <w:t>Enforce recipient restrictions per role: parents message linked teachers only</w:t>
+      </w:r>
+    </w:p>
+    <w:p>
+      <w:pPr>
+        <w:pStyle w:val="Heading3"/>
+      </w:pPr>
+      <w:r>
+        <w:t>7.19 Role-Based Messaging Restrictions (IMPLEMENTED)</w:t>
+      </w:r>
+    </w:p>
+    <w:p>
+      <w:pPr>
+        <w:pStyle w:val="ListBullet"/>
+      </w:pPr>
+      <w:r>
+        <w:t>Full keyboard accessibility with focus-visible styles</w:t>
+      </w:r>
+    </w:p>
+    <w:p>
+      <w:pPr>
+        <w:pStyle w:val="ListBullet"/>
+      </w:pPr>
+      <w:r>
+        <w:t>Recent Activity items are clickable with navigation to related resources</w:t>
+      </w:r>
+    </w:p>
+    <w:p>
+      <w:pPr>
+        <w:pStyle w:val="ListBullet"/>
+      </w:pPr>
+      <w:r>
+        <w:t>Platform Health metric cards navigate to relevant admin pages on click</w:t>
+      </w:r>
+    </w:p>
+    <w:p>
+      <w:pPr>
+        <w:pStyle w:val="Heading3"/>
+      </w:pPr>
+      <w:r>
+        <w:t>7.18 Admin Dashboard Clickable Metrics (IMPLEMENTED)</w:t>
+      </w:r>
+    </w:p>
+    <w:p>
+      <w:pPr>
+        <w:pStyle w:val="ListBullet"/>
+      </w:pPr>
+      <w:r>
+        <w:t>Owner-accessible access log tab showing who viewed/downloaded materials</w:t>
+      </w:r>
+    </w:p>
+    <w:p>
+      <w:pPr>
+        <w:pStyle w:val="ListBullet"/>
+      </w:pPr>
+      <w:r>
+        <w:t>Material access audit logging: view, download, and upload events recorded</w:t>
+      </w:r>
+    </w:p>
+    <w:p>
+      <w:pPr>
+        <w:pStyle w:val="ListBullet"/>
+      </w:pPr>
+      <w:r>
+        <w:t>Trust-circle access control: only creator, enrolled students, and linked parents/teachers</w:t>
+      </w:r>
+    </w:p>
+    <w:p>
+      <w:pPr>
+        <w:pStyle w:val="Heading3"/>
+      </w:pPr>
+      <w:r>
+        <w:t>7.17 Document Privacy &amp; Access Control (IMPLEMENTED)</w:t>
+      </w:r>
+    </w:p>
+    <w:p>
+      <w:pPr>
+        <w:pStyle w:val="ListBullet"/>
+      </w:pPr>
+      <w:r>
+        <w:t>Role-based deep linking in email buttons (parent to My Kids, student to study tools)</w:t>
+      </w:r>
+    </w:p>
+    <w:p>
+      <w:pPr>
+        <w:pStyle w:val="ListBullet"/>
+      </w:pPr>
+      <w:r>
+        <w:t>Shareable HTML email format designed for viral growth (forward to grandparents)</w:t>
+      </w:r>
+    </w:p>
+    <w:p>
+      <w:pPr>
+        <w:pStyle w:val="ListBullet"/>
+      </w:pPr>
+      <w:r>
+        <w:t>AI-generated encouragement messages personalized per child</w:t>
+      </w:r>
+    </w:p>
+    <w:p>
+      <w:pPr>
+        <w:pStyle w:val="ListBullet"/>
+      </w:pPr>
+      <w:r>
+        <w:t>Per-child engagement report: XP earned, study streaks, quizzes completed, upcoming deadlines</w:t>
+      </w:r>
+    </w:p>
+    <w:p>
+      <w:pPr>
+        <w:pStyle w:val="Heading3"/>
+      </w:pPr>
+      <w:r>
+        <w:t>7.16 Weekly Family Report Email (IMPLEMENTED)</w:t>
+      </w:r>
+    </w:p>
+    <w:p>
+      <w:pPr>
+        <w:pStyle w:val="ListBullet"/>
+      </w:pPr>
+      <w:r>
+        <w:t>RBAC restricted to parent, teacher, and admin roles; 5 MB file size limit</w:t>
+      </w:r>
+    </w:p>
+    <w:p>
+      <w:pPr>
+        <w:pStyle w:val="ListBullet"/>
+      </w:pPr>
+      <w:r>
+        <w:t>Bulk import with per-row savepoint transaction handling (partial failures preserved)</w:t>
+      </w:r>
+    </w:p>
+    <w:p>
+      <w:pPr>
+        <w:pStyle w:val="ListBullet"/>
+      </w:pPr>
+      <w:r>
+        <w:t>Upload CSV with client-side preview and validation before submission</w:t>
+      </w:r>
+    </w:p>
+    <w:p>
+      <w:pPr>
+        <w:pStyle w:val="ListBullet"/>
+      </w:pPr>
+      <w:r>
+        <w:t>Download pre-formatted CSV templates for courses, students, and assignments</w:t>
+      </w:r>
+    </w:p>
+    <w:p>
+      <w:pPr>
+        <w:pStyle w:val="Heading3"/>
+      </w:pPr>
+      <w:r>
+        <w:t>7.15 CSV Template Import (IMPLEMENTED)</w:t>
+      </w:r>
+    </w:p>
+    <w:p>
+      <w:pPr>
+        <w:pStyle w:val="ListBullet"/>
+      </w:pPr>
+      <w:r>
+        <w:t>Source image descriptions passed to chatbot for diagram citation</w:t>
+      </w:r>
+    </w:p>
+    <w:p>
+      <w:pPr>
+        <w:pStyle w:val="ListBullet"/>
+      </w:pPr>
+      <w:r>
+        <w:t>Save responses as sub-study guides or class materials (no additional credits)</w:t>
+      </w:r>
+    </w:p>
+    <w:p>
+      <w:pPr>
+        <w:pStyle w:val="ListBullet"/>
+      </w:pPr>
+      <w:r>
+        <w:t>Text selection Ask Chat Bot replaces Generate Study Material - auto-injects and submits</w:t>
+      </w:r>
+    </w:p>
+    <w:p>
+      <w:pPr>
+        <w:pStyle w:val="ListBullet"/>
+      </w:pPr>
+      <w:r>
+        <w:t>Redesigned UI: vertical action rows, credit display, responsive panel layout</w:t>
+      </w:r>
+    </w:p>
+    <w:p>
+      <w:pPr>
+        <w:pStyle w:val="ListBullet"/>
+      </w:pPr>
+      <w:r>
+        <w:t>0.25 credits per question, 20 questions/hour rate limit, Haiku model</w:t>
+      </w:r>
+    </w:p>
+    <w:p>
+      <w:pPr>
+        <w:pStyle w:val="ListBullet"/>
+      </w:pPr>
+      <w:r>
+        <w:t>Context-aware chatbot Q&amp;A on study guide pages - uses guide content as AI context</w:t>
+      </w:r>
+    </w:p>
+    <w:p>
+      <w:pPr>
+        <w:pStyle w:val="Heading3"/>
+      </w:pPr>
+      <w:r>
+        <w:t>7.14 Study Q&amp;A Contextual Chatbot (IMPLEMENTED)</w:t>
+      </w:r>
+    </w:p>
+    <w:p>
+      <w:pPr>
+        <w:pStyle w:val="ListBullet"/>
+      </w:pPr>
+      <w:r>
+        <w:t>Mobile bottom-sheet popovers with backdrop overlay on viewports &lt; 600px</w:t>
+      </w:r>
+    </w:p>
+    <w:p>
+      <w:pPr>
+        <w:pStyle w:val="ListBullet"/>
+      </w:pPr>
+      <w:r>
+        <w:t>Clickable task count - popover with linked tasks, due dates, and completion status</w:t>
+      </w:r>
+    </w:p>
+    <w:p>
+      <w:pPr>
+        <w:pStyle w:val="ListBullet"/>
+      </w:pPr>
+      <w:r>
+        <w:t>Clickable class name - popover with course details and View Course navigation</w:t>
+      </w:r>
+    </w:p>
+    <w:p>
+      <w:pPr>
+        <w:pStyle w:val="ListBullet"/>
+      </w:pPr>
+      <w:r>
+        <w:t>Consistent metadata bar (Class, Created Date, Tasks) across all 6 content tabs</w:t>
+      </w:r>
+    </w:p>
+    <w:p>
+      <w:pPr>
+        <w:pStyle w:val="Heading3"/>
+      </w:pPr>
+      <w:r>
+        <w:t>7.13 Course Material Metadata &amp; Clickable Popovers (IMPLEMENTED)</w:t>
+      </w:r>
+    </w:p>
+    <w:p>
+      <w:pPr>
+        <w:pStyle w:val="ListBullet"/>
+      </w:pPr>
+      <w:r>
+        <w:t>Student self-access to own report cards; parent cross-child view on My Kids page</w:t>
+      </w:r>
+    </w:p>
+    <w:p>
+      <w:pPr>
+        <w:pStyle w:val="ListBullet"/>
+      </w:pPr>
+      <w:r>
+        <w:t>Caching layer prevents redundant AI analysis (SHA-256 content hash)</w:t>
+      </w:r>
+    </w:p>
+    <w:p>
+      <w:pPr>
+        <w:pStyle w:val="ListBullet"/>
+      </w:pPr>
+      <w:r>
+        <w:t>Career path analysis - AI suggests career directions based on academic strengths</w:t>
+      </w:r>
+    </w:p>
+    <w:p>
+      <w:pPr>
+        <w:pStyle w:val="ListBullet"/>
+      </w:pPr>
+      <w:r>
+        <w:t>AI extracts grades, subject performance, strengths/weaknesses per subject</w:t>
+      </w:r>
+    </w:p>
+    <w:p>
+      <w:pPr>
+        <w:pStyle w:val="ListBullet"/>
+      </w:pPr>
+      <w:r>
+        <w:t>Parents upload school-issued PDF report cards for AI-powered analysis</w:t>
+      </w:r>
+    </w:p>
+    <w:p>
+      <w:pPr>
+        <w:pStyle w:val="Heading3"/>
+      </w:pPr>
+      <w:r>
+        <w:t>7.12 School Report Card Upload &amp; AI Analysis (IMPLEMENTED)</w:t>
       </w:r>
     </w:p>
     <w:p>
@@ -8466,6 +8786,70 @@
     </w:p>
     <w:p>
       <w:pPr>
+        <w:pStyle w:val="ListBullet"/>
+      </w:pPr>
+      <w:r>
+        <w:t>[x] Study Q&amp;A Contextual Chatbot - IMPLEMENTED (#2056, PR #2548, #2561, #2574)</w:t>
+      </w:r>
+    </w:p>
+    <w:p>
+      <w:pPr>
+        <w:pStyle w:val="ListBullet"/>
+      </w:pPr>
+      <w:r>
+        <w:t>[x] CSV Template Import - IMPLEMENTED (#2167, PR #2584)</w:t>
+      </w:r>
+    </w:p>
+    <w:p>
+      <w:pPr>
+        <w:pStyle w:val="ListBullet"/>
+      </w:pPr>
+      <w:r>
+        <w:t>[x] Weekly Family Report Email - IMPLEMENTED (#2228, PR #2584)</w:t>
+      </w:r>
+    </w:p>
+    <w:p>
+      <w:pPr>
+        <w:pStyle w:val="ListBullet"/>
+      </w:pPr>
+      <w:r>
+        <w:t>[x] School Report Card Upload &amp; AI Analysis - IMPLEMENTED (#2286)</w:t>
+      </w:r>
+    </w:p>
+    <w:p>
+      <w:pPr>
+        <w:pStyle w:val="ListBullet"/>
+      </w:pPr>
+      <w:r>
+        <w:t>[x] Course Material Metadata &amp; Clickable Popovers - IMPLEMENTED (#2395)</w:t>
+      </w:r>
+    </w:p>
+    <w:p>
+      <w:pPr>
+        <w:pStyle w:val="ListBullet"/>
+      </w:pPr>
+      <w:r>
+        <w:t>[x] Document Privacy &amp; Access Control - IMPLEMENTED (#2269-#2274)</w:t>
+      </w:r>
+    </w:p>
+    <w:p>
+      <w:pPr>
+        <w:pStyle w:val="ListBullet"/>
+      </w:pPr>
+      <w:r>
+        <w:t>[x] Admin Dashboard Clickable Metrics - IMPLEMENTED (#2536, PR #2544)</w:t>
+      </w:r>
+    </w:p>
+    <w:p>
+      <w:pPr>
+        <w:pStyle w:val="ListBullet"/>
+      </w:pPr>
+      <w:r>
+        <w:t>[x] Role-Based Messaging Restrictions - IMPLEMENTED (#2408, PR #2423)</w:t>
+      </w:r>
+    </w:p>
+    <w:p>
+      <w:pPr>
         <w:pStyle w:val="Heading3"/>
       </w:pPr>
       <w:r>
@@ -10830,6 +11214,118 @@
     <w:p>
       <w:r>
         <w:t>Model Context Protocol server for AI assistant access. Issues #2191-#2199. Server foundation, JWT auth, study tools (7), tutor tools (3), student resources (6), import tools (5). First education platform with native MCP support.</w:t>
+      </w:r>
+    </w:p>
+    <w:p>
+      <w:pPr>
+        <w:pStyle w:val="Heading2"/>
+      </w:pPr>
+      <w:r>
+        <w:t>6.119 Document Privacy &amp; IP Protection (IMPLEMENTED)</w:t>
+      </w:r>
+    </w:p>
+    <w:p>
+      <w:pPr/>
+      <w:r>
+        <w:t>Trust-circle access control for course materials. Only creator, enrolled students, linked parents/teachers can view. Audit logging tracks view/download/upload events. Owner-visible access log tab. Issues #2269-#2274.</w:t>
+      </w:r>
+    </w:p>
+    <w:p>
+      <w:pPr>
+        <w:pStyle w:val="Heading2"/>
+      </w:pPr>
+      <w:r>
+        <w:t>6.120 School Report Card Upload &amp; AI Analysis (IMPLEMENTED)</w:t>
+      </w:r>
+    </w:p>
+    <w:p>
+      <w:pPr/>
+      <w:r>
+        <w:t>Parents upload PDF report cards. AI extracts grades, identifies strengths/weaknesses, suggests career paths. SHA-256 content hash prevents redundant analysis. Frontend pages wired into My Kids and sidebar nav. Issues #2286, #2317-#2361.</w:t>
+      </w:r>
+    </w:p>
+    <w:p>
+      <w:pPr>
+        <w:pStyle w:val="Heading2"/>
+      </w:pPr>
+      <w:r>
+        <w:t>6.121 Course Material Metadata &amp; Clickable Popovers (IMPLEMENTED)</w:t>
+      </w:r>
+    </w:p>
+    <w:p>
+      <w:pPr/>
+      <w:r>
+        <w:t>Shared ContentMetaBar component renders in all 6 content tabs. Class/Tasks are clickable with popovers showing details and navigation. Mobile bottom-sheet with backdrop overlay. Issues #2259, #2260, #2388-#2394. PR #2395.</w:t>
+      </w:r>
+    </w:p>
+    <w:p>
+      <w:pPr>
+        <w:pStyle w:val="Heading2"/>
+      </w:pPr>
+      <w:r>
+        <w:t>6.122 CSV Template Import - Bulk Data Upload (IMPLEMENTED)</w:t>
+      </w:r>
+    </w:p>
+    <w:p>
+      <w:pPr/>
+      <w:r>
+        <w:t>Template download, CSV upload with preview/validation, bulk import for courses/students/assignments. Per-row savepoint transaction handling. RBAC restricted. 5 MB file size limit. Issue #2167. PR #2584, review fixes PR #2589.</w:t>
+      </w:r>
+    </w:p>
+    <w:p>
+      <w:pPr>
+        <w:pStyle w:val="Heading2"/>
+      </w:pPr>
+      <w:r>
+        <w:t>6.123 Weekly Family Report Email (IMPLEMENTED)</w:t>
+      </w:r>
+    </w:p>
+    <w:p>
+      <w:pPr/>
+      <w:r>
+        <w:t>Per-child engagement scores, streaks, quizzes, AI encouragement. Shareable HTML email for viral growth. Role-based deep linking in CTAs. Issue #2228. PR #2584.</w:t>
+      </w:r>
+    </w:p>
+    <w:p>
+      <w:pPr>
+        <w:pStyle w:val="Heading2"/>
+      </w:pPr>
+      <w:r>
+        <w:t>6.124 Study Q&amp;A Chatbot Redesign (IMPLEMENTED)</w:t>
+      </w:r>
+    </w:p>
+    <w:p>
+      <w:pPr/>
+      <w:r>
+        <w:t>Redesigned chatbot UI: header/panel restructure, vertical action rows replacing chips, input bar redesign, medium-viewport breakpoint. Source image descriptions for diagram citation. Access check widened to trust circle. Ask Chat Bot replaces Generate Study Material tooltip (#2554). Race condition fixes in pendingQuestion injection (#2567-#2569). PRs #2548, #2561, #2574, #2578.</w:t>
+      </w:r>
+    </w:p>
+    <w:p>
+      <w:pPr>
+        <w:pStyle w:val="Heading2"/>
+      </w:pPr>
+      <w:r>
+        <w:t>6.125 Admin Dashboard Clickable Metrics (IMPLEMENTED)</w:t>
+      </w:r>
+    </w:p>
+    <w:p>
+      <w:pPr/>
+      <w:r>
+        <w:t>Platform Health metric cards and Recent Activity items now clickable with navigation. Keyboard accessible with focus-visible styles. Extracted scroll helper utility. Issue #2536. PR #2544.</w:t>
+      </w:r>
+    </w:p>
+    <w:p>
+      <w:pPr>
+        <w:pStyle w:val="Heading2"/>
+      </w:pPr>
+      <w:r>
+        <w:t>6.126 Role-Based Messaging Restrictions (IMPLEMENTED)</w:t>
+      </w:r>
+    </w:p>
+    <w:p>
+      <w:pPr/>
+      <w:r>
+        <w:t>Enforce per-role recipient restrictions in messaging. Parents to linked teachers only. Students to own teachers. Teachers to enrolled student parents + direct-linked parents. Admin to anyone. Issue #2408. PR #2423.</w:t>
       </w:r>
     </w:p>
     <w:sectPr>

</xml_diff>

<commit_message>
docs: update Feature Catalog and Requirements with UTDF deployment (April 11, 2026)
Co-Authored-By: Claude Opus 4.6 (1M context) <noreply@anthropic.com>
</commit_message>
<xml_diff>
--- a/docs/ClassBridge_Complete_Requirements_Document.docx
+++ b/docs/ClassBridge_Complete_Requirements_Document.docx
@@ -22,12 +22,12 @@
     </w:p>
     <w:p>
       <w:r>
-        <w:t>Version: 2.4</w:t>
-      </w:r>
-    </w:p>
-    <w:p>
-      <w:r>
-        <w:t>Date: 2026-04-08</w:t>
+        <w:t>Version: 2.5</w:t>
+      </w:r>
+    </w:p>
+    <w:p>
+      <w:r>
+        <w:t>Date: 2026-04-11</w:t>
       </w:r>
     </w:p>
     <w:p>
@@ -10620,6 +10620,249 @@
         </w:tc>
       </w:tr>
     </w:tbl>
+    <w:p/>
+    <w:p>
+      <w:r>
+        <w:t>____________________________________________________________</w:t>
+      </w:r>
+    </w:p>
+    <w:p>
+      <w:pPr>
+        <w:pStyle w:val="Heading2"/>
+      </w:pPr>
+      <w:r>
+        <w:t>§6.131 — Unified Template + Detection Framework (UTDF)</w:t>
+      </w:r>
+    </w:p>
+    <w:p>
+      <w:r>
+        <w:t>Status: DEPLOYED (April 11, 2026)</w:t>
+      </w:r>
+    </w:p>
+    <w:p>
+      <w:r>
+        <w:t>Epic: CB-UTDF-001 | PRD: CB-UTDF-001-PRD-v1.md</w:t>
+      </w:r>
+    </w:p>
+    <w:p>
+      <w:r>
+        <w:t>Issues: #2948-#2961, #3019-#3030 | PRs: #3068, #3085</w:t>
+      </w:r>
+    </w:p>
+    <w:p/>
+    <w:p>
+      <w:pPr>
+        <w:pStyle w:val="Heading3"/>
+      </w:pPr>
+      <w:r>
+        <w:t>Overview</w:t>
+      </w:r>
+    </w:p>
+    <w:p>
+      <w:r>
+        <w:t>Comprehensive upgrade to the AI study tools pipeline. Replaces manual document type and study goal selection with AI-powered auto-detection. Adds worksheet generation as a first-class output type alongside study guides, quizzes, and flashcards. Introduces ClassificationBar UX, suggestion chips, and auto-detect-and-go workflow.</w:t>
+      </w:r>
+    </w:p>
+    <w:p/>
+    <w:p>
+      <w:pPr>
+        <w:pStyle w:val="Heading3"/>
+      </w:pPr>
+      <w:r>
+        <w:t>User Stories (13 Stories)</w:t>
+      </w:r>
+    </w:p>
+    <w:p>
+      <w:pPr>
+        <w:pStyle w:val="ListBullet"/>
+      </w:pPr>
+      <w:r>
+        <w:t>S1: Extended Document Classification — AI detects document type, subject, and confidence with retry logic</w:t>
+      </w:r>
+    </w:p>
+    <w:p>
+      <w:pPr>
+        <w:pStyle w:val="ListBullet"/>
+      </w:pPr>
+      <w:r>
+        <w:t>S2: Subject Detection — Extracts subject and grade level from uploaded content</w:t>
+      </w:r>
+    </w:p>
+    <w:p>
+      <w:pPr>
+        <w:pStyle w:val="ListBullet"/>
+      </w:pPr>
+      <w:r>
+        <w:t>S3: Template Resolver — 9 named templates (study_guide, quiz, flashcards, 4 worksheet variants, weak_area_analysis, high_level_summary) with goal modifiers</w:t>
+      </w:r>
+    </w:p>
+    <w:p>
+      <w:pPr>
+        <w:pStyle w:val="ListBullet"/>
+      </w:pPr>
+      <w:r>
+        <w:t>S4: ClassificationBar — Human-readable sentence UX replacing dropdown selectors</w:t>
+      </w:r>
+    </w:p>
+    <w:p>
+      <w:pPr>
+        <w:pStyle w:val="ListBullet"/>
+      </w:pPr>
+      <w:r>
+        <w:t>S5: Suggestion Chips — Visual hierarchy of recommended tools based on detected document type</w:t>
+      </w:r>
+    </w:p>
+    <w:p>
+      <w:pPr>
+        <w:pStyle w:val="ListBullet"/>
+      </w:pPr>
+      <w:r>
+        <w:t>S6: Child Inline Pills — Compact child selector replacing blocking modal</w:t>
+      </w:r>
+    </w:p>
+    <w:p>
+      <w:pPr>
+        <w:pStyle w:val="ListBullet"/>
+      </w:pPr>
+      <w:r>
+        <w:t>S7: Classification Override Panel — Simplified inline correction of AI classification</w:t>
+      </w:r>
+    </w:p>
+    <w:p>
+      <w:pPr>
+        <w:pStyle w:val="ListBullet"/>
+      </w:pPr>
+      <w:r>
+        <w:t>S8: Worksheet Generation — 4 variants (practice, review, test_prep, homework) with inline viewer and print CSS</w:t>
+      </w:r>
+    </w:p>
+    <w:p>
+      <w:pPr>
+        <w:pStyle w:val="ListBullet"/>
+      </w:pPr>
+      <w:r>
+        <w:t>S9: Answer Key Generation — Stored in answer_key_markdown column</w:t>
+      </w:r>
+    </w:p>
+    <w:p>
+      <w:pPr>
+        <w:pStyle w:val="ListBullet"/>
+      </w:pPr>
+      <w:r>
+        <w:t>S10: Weak Area Analysis — Claude Sonnet model for deeper pedagogical analysis</w:t>
+      </w:r>
+    </w:p>
+    <w:p>
+      <w:pPr>
+        <w:pStyle w:val="ListBullet"/>
+      </w:pPr>
+      <w:r>
+        <w:t>S13: Tab Consolidation — 5 primary tabs + More dropdown</w:t>
+      </w:r>
+    </w:p>
+    <w:p>
+      <w:pPr>
+        <w:pStyle w:val="ListBullet"/>
+      </w:pPr>
+      <w:r>
+        <w:t>S14: Mobile — ClassificationBar + chips in Expo WebView</w:t>
+      </w:r>
+    </w:p>
+    <w:p>
+      <w:pPr>
+        <w:pStyle w:val="ListBullet"/>
+      </w:pPr>
+      <w:r>
+        <w:t>S15: Admin Migration Endpoint — /run-migrations for manual schema changes</w:t>
+      </w:r>
+    </w:p>
+    <w:p/>
+    <w:p>
+      <w:pPr>
+        <w:pStyle w:val="Heading3"/>
+      </w:pPr>
+      <w:r>
+        <w:t>Architecture Review Decisions</w:t>
+      </w:r>
+    </w:p>
+    <w:p>
+      <w:pPr>
+        <w:pStyle w:val="ListBullet"/>
+      </w:pPr>
+      <w:r>
+        <w:t>R1: Extend study_guides table (guide_type=worksheet) instead of separate worksheets table</w:t>
+      </w:r>
+    </w:p>
+    <w:p>
+      <w:pPr>
+        <w:pStyle w:val="ListBullet"/>
+      </w:pPr>
+      <w:r>
+        <w:t>R2: Templates as prompt variants in StudyGuideStrategyService, not database tables</w:t>
+      </w:r>
+    </w:p>
+    <w:p>
+      <w:pPr>
+        <w:pStyle w:val="ListBullet"/>
+      </w:pPr>
+      <w:r>
+        <w:t>R3: Classification stored on course_contents (detected_type, detected_subject, classification_confidence)</w:t>
+      </w:r>
+    </w:p>
+    <w:p>
+      <w:pPr>
+        <w:pStyle w:val="ListBullet"/>
+      </w:pPr>
+      <w:r>
+        <w:t>R4: Variable credit cost via check_ai_usage(cost=N) parameter</w:t>
+      </w:r>
+    </w:p>
+    <w:p>
+      <w:pPr>
+        <w:pStyle w:val="ListBullet"/>
+      </w:pPr>
+      <w:r>
+        <w:t>R5: Tab consolidation with 5 primary + More dropdown (not scrollable tabs)</w:t>
+      </w:r>
+    </w:p>
+    <w:p>
+      <w:pPr>
+        <w:pStyle w:val="ListBullet"/>
+      </w:pPr>
+      <w:r>
+        <w:t>R6: Auto-detect-and-go UX — skip manual selection when classification confidence is high</w:t>
+      </w:r>
+    </w:p>
+    <w:p>
+      <w:pPr>
+        <w:pStyle w:val="ListBullet"/>
+      </w:pPr>
+      <w:r>
+        <w:t>R7: Claude Sonnet for weak area analysis (higher quality justifies ~$0.018/call cost)</w:t>
+      </w:r>
+    </w:p>
+    <w:p>
+      <w:pPr>
+        <w:pStyle w:val="ListBullet"/>
+      </w:pPr>
+      <w:r>
+        <w:t>R8: pg_try_advisory_lock for migrations (Cloud Run compatible, non-blocking)</w:t>
+      </w:r>
+    </w:p>
+    <w:p/>
+    <w:p>
+      <w:pPr>
+        <w:pStyle w:val="Heading3"/>
+      </w:pPr>
+      <w:r>
+        <w:t>Deployment Notes</w:t>
+      </w:r>
+    </w:p>
+    <w:p>
+      <w:r>
+        <w:t>Deployed via PR #3068 (17 parallel streams merged via integration branch). Production incident caused by pg_advisory_lock incompatibility with Cloud Run rolling deployments. Resolved with manual column creation and pg_try_advisory_lock fix. Post-deployment fixes in PR #3085.</w:t>
+      </w:r>
+    </w:p>
     <w:p/>
     <w:p>
       <w:pPr>

</xml_diff>